<commit_message>
fix: tests end to end
</commit_message>
<xml_diff>
--- a/docs/entregas/CLTech - ERS.docx
+++ b/docs/entregas/CLTech - ERS.docx
@@ -2134,7 +2134,7 @@
     </w:p>
     <w:sdt>
       <w:sdtPr>
-        <w:id w:val="-1500141066"/>
+        <w:id w:val="-644944995"/>
         <w:docPartObj>
           <w:docPartGallery w:val="Table of Contents"/>
           <w:docPartUnique w:val="1"/>
@@ -4749,7 +4749,7 @@
                 <w:rFonts w:ascii="Arial" w:cs="Arial" w:eastAsia="Arial" w:hAnsi="Arial"/>
                 <w:rtl w:val="0"/>
               </w:rPr>
-              <w:t xml:space="preserve">Supabase Pro, com armazenamento de currículos e backup diário, R$ 140,00 mensaisl</w:t>
+              <w:t xml:space="preserve">Supabase Pro, com armazenamento de currículos e backup diário, R$ 140,00 mensais</w:t>
             </w:r>
             <w:r>
               <w:rPr>
@@ -12734,33 +12734,6 @@
           <w:rtl w:val="0"/>
         </w:rPr>
         <w:t xml:space="preserve">Passos de Execução:</w:t>
-      </w:r>
-    </w:p>
-    <w:p>
-      <w:pPr>
-        <w:pBdr>
-          <w:top w:color="auto" w:space="0" w:sz="0" w:val="none"/>
-          <w:bottom w:color="auto" w:space="0" w:sz="0" w:val="none"/>
-          <w:right w:color="auto" w:space="0" w:sz="0" w:val="none"/>
-          <w:between w:color="auto" w:space="0" w:sz="0" w:val="none"/>
-        </w:pBdr>
-        <w:spacing w:line="276" w:lineRule="auto"/>
-        <w:ind w:left="720" w:firstLine="0"/>
-        <w:rPr>
-          <w:rFonts w:ascii="Arial" w:cs="Arial" w:eastAsia="Arial" w:hAnsi="Arial"/>
-          <w:b w:val="1"/>
-          <w:bCs w:val="1"/>
-          <w:color w:val="1f1f1f"/>
-        </w:rPr>
-      </w:pPr>
-      <w:r>
-        <w:rPr>
-          <w:rFonts w:ascii="Arial" w:cs="Arial" w:eastAsia="Arial" w:hAnsi="Arial"/>
-          <w:b w:val="1"/>
-          <w:bCs w:val="1"/>
-          <w:color w:val="1f1f1f"/>
-          <w:rtl w:val="0"/>
-        </w:rPr>
         <w:br w:type="textWrapping"/>
       </w:r>
     </w:p>
@@ -20782,8 +20755,21 @@
           <w:vertAlign w:val="baseline"/>
           <w:rtl w:val="0"/>
         </w:rPr>
-        <w:t xml:space="preserve"> [Inserir Link do Figma/ou Github (SE HOUVER)]</w:t>
-      </w:r>
+        <w:t xml:space="preserve"> </w:t>
+      </w:r>
+      <w:hyperlink r:id="rId6">
+        <w:r>
+          <w:rPr>
+            <w:rFonts w:ascii="Arial" w:cs="Arial" w:eastAsia="Arial" w:hAnsi="Arial"/>
+            <w:color w:val="1155cc"/>
+            <w:sz w:val="20"/>
+            <w:szCs w:val="20"/>
+            <w:u w:val="single"/>
+            <w:rtl w:val="0"/>
+          </w:rPr>
+          <w:t xml:space="preserve">https://www.figma.com/design/OqeGpUnKlM4VUqxltPV7au/Sem-t%C3%ADtulo?node-id=0-1&amp;t=Gwxnz7jmiy58WbX5-1</w:t>
+        </w:r>
+      </w:hyperlink>
       <w:r>
         <w:rPr>
           <w:rtl w:val="0"/>
@@ -20888,6 +20874,58 @@
       </w:pPr>
       <w:r>
         <w:rPr>
+          <w:rtl w:val="0"/>
+        </w:rPr>
+      </w:r>
+    </w:p>
+    <w:p>
+      <w:pPr>
+        <w:keepNext w:val="0"/>
+        <w:keepLines w:val="0"/>
+        <w:pageBreakBefore w:val="0"/>
+        <w:widowControl w:val="1"/>
+        <w:pBdr>
+          <w:top w:space="0" w:sz="0" w:val="nil"/>
+          <w:left w:space="0" w:sz="0" w:val="nil"/>
+          <w:bottom w:space="0" w:sz="0" w:val="nil"/>
+          <w:right w:space="0" w:sz="0" w:val="nil"/>
+          <w:between w:space="0" w:sz="0" w:val="nil"/>
+        </w:pBdr>
+        <w:shd w:fill="auto" w:val="clear"/>
+        <w:spacing w:after="0" w:before="0" w:line="360" w:lineRule="auto"/>
+        <w:ind w:left="1440" w:right="0" w:firstLine="0"/>
+        <w:jc w:val="left"/>
+        <w:rPr>
+          <w:rFonts w:ascii="Arial" w:cs="Arial" w:eastAsia="Arial" w:hAnsi="Arial"/>
+          <w:color w:val="ee0000"/>
+          <w:sz w:val="20"/>
+          <w:szCs w:val="20"/>
+        </w:rPr>
+      </w:pPr>
+      <w:r>
+        <w:rPr>
+          <w:rtl w:val="0"/>
+        </w:rPr>
+      </w:r>
+    </w:p>
+    <w:p>
+      <w:pPr>
+        <w:keepNext w:val="0"/>
+        <w:keepLines w:val="0"/>
+        <w:pageBreakBefore w:val="0"/>
+        <w:widowControl w:val="1"/>
+        <w:pBdr>
+          <w:top w:space="0" w:sz="0" w:val="nil"/>
+          <w:left w:space="0" w:sz="0" w:val="nil"/>
+          <w:bottom w:space="0" w:sz="0" w:val="nil"/>
+          <w:right w:space="0" w:sz="0" w:val="nil"/>
+          <w:between w:space="0" w:sz="0" w:val="nil"/>
+        </w:pBdr>
+        <w:shd w:fill="auto" w:val="clear"/>
+        <w:spacing w:after="0" w:before="0" w:line="360" w:lineRule="auto"/>
+        <w:ind w:left="1440" w:right="0" w:firstLine="0"/>
+        <w:jc w:val="left"/>
+        <w:rPr>
           <w:rFonts w:ascii="Arial" w:cs="Arial" w:eastAsia="Arial" w:hAnsi="Arial"/>
           <w:b w:val="0"/>
           <w:bCs w:val="0"/>
@@ -20901,134 +20939,403 @@
           <w:u w:val="none"/>
           <w:shd w:fill="auto" w:val="clear"/>
           <w:vertAlign w:val="baseline"/>
-          <w:rtl w:val="0"/>
-        </w:rPr>
-        <w:t xml:space="preserve">Siga as telas que pedi na sprint</w:t>
-      </w:r>
-      <w:r>
-        <w:rPr>
-          <w:rtl w:val="0"/>
-        </w:rPr>
-      </w:r>
-    </w:p>
-    <w:p>
-      <w:pPr>
-        <w:keepNext w:val="0"/>
-        <w:keepLines w:val="0"/>
-        <w:pageBreakBefore w:val="0"/>
+        </w:rPr>
+      </w:pPr>
+      <w:r>
+        <w:rPr>
+          <w:rtl w:val="0"/>
+        </w:rPr>
+      </w:r>
+    </w:p>
+    <w:p>
+      <w:pPr>
+        <w:pStyle w:val="Heading2"/>
+        <w:spacing w:line="360" w:lineRule="auto"/>
+        <w:jc w:val="left"/>
+        <w:rPr/>
+      </w:pPr>
+      <w:bookmarkStart w:colFirst="0" w:colLast="0" w:name="_7z3iqu93lx67" w:id="18"/>
+      <w:bookmarkEnd w:id="18"/>
+      <w:r>
+        <w:rPr>
+          <w:rtl w:val="0"/>
+        </w:rPr>
+      </w:r>
+      <w:r>
+        <w:drawing>
+          <wp:anchor allowOverlap="1" behindDoc="0" distB="114300" distT="114300" distL="114300" distR="114300" hidden="0" layoutInCell="1" locked="0" relativeHeight="0" simplePos="0">
+            <wp:simplePos x="0" y="0"/>
+            <wp:positionH relativeFrom="column">
+              <wp:posOffset>-471</wp:posOffset>
+            </wp:positionH>
+            <wp:positionV relativeFrom="paragraph">
+              <wp:posOffset>114300</wp:posOffset>
+            </wp:positionV>
+            <wp:extent cx="6247455" cy="5842000"/>
+            <wp:effectExtent b="0" l="0" r="0" t="0"/>
+            <wp:wrapSquare wrapText="bothSides" distB="114300" distT="114300" distL="114300" distR="114300"/>
+            <wp:docPr id="1" name="image1.png"/>
+            <a:graphic>
+              <a:graphicData uri="http://schemas.openxmlformats.org/drawingml/2006/picture">
+                <pic:pic>
+                  <pic:nvPicPr>
+                    <pic:cNvPr id="0" name="image1.png"/>
+                    <pic:cNvPicPr preferRelativeResize="0"/>
+                  </pic:nvPicPr>
+                  <pic:blipFill>
+                    <a:blip r:embed="rId7"/>
+                    <a:srcRect b="0" l="0" r="0" t="0"/>
+                    <a:stretch>
+                      <a:fillRect/>
+                    </a:stretch>
+                  </pic:blipFill>
+                  <pic:spPr>
+                    <a:xfrm>
+                      <a:off x="0" y="0"/>
+                      <a:ext cx="6247455" cy="5842000"/>
+                    </a:xfrm>
+                    <a:prstGeom prst="rect"/>
+                    <a:ln/>
+                  </pic:spPr>
+                </pic:pic>
+              </a:graphicData>
+            </a:graphic>
+          </wp:anchor>
+        </w:drawing>
+      </w:r>
+    </w:p>
+    <w:p>
+      <w:pPr>
+        <w:rPr/>
+      </w:pPr>
+      <w:r>
+        <w:rPr>
+          <w:rtl w:val="0"/>
+        </w:rPr>
+      </w:r>
+    </w:p>
+    <w:p>
+      <w:pPr>
+        <w:rPr/>
+      </w:pPr>
+      <w:r>
+        <w:rPr>
+          <w:rtl w:val="0"/>
+        </w:rPr>
+      </w:r>
+    </w:p>
+    <w:p>
+      <w:pPr>
+        <w:rPr/>
+      </w:pPr>
+      <w:r>
+        <w:rPr>
+          <w:rtl w:val="0"/>
+        </w:rPr>
+      </w:r>
+    </w:p>
+    <w:p>
+      <w:pPr>
+        <w:rPr/>
+      </w:pPr>
+      <w:r>
+        <w:rPr>
+          <w:rtl w:val="0"/>
+        </w:rPr>
+      </w:r>
+    </w:p>
+    <w:p>
+      <w:pPr>
+        <w:rPr/>
+      </w:pPr>
+      <w:r>
+        <w:rPr>
+          <w:rtl w:val="0"/>
+        </w:rPr>
+      </w:r>
+    </w:p>
+    <w:p>
+      <w:pPr>
+        <w:rPr/>
+      </w:pPr>
+      <w:r>
+        <w:rPr>
+          <w:rtl w:val="0"/>
+        </w:rPr>
+      </w:r>
+    </w:p>
+    <w:p>
+      <w:pPr>
+        <w:rPr/>
+      </w:pPr>
+      <w:r>
+        <w:rPr>
+          <w:rtl w:val="0"/>
+        </w:rPr>
+      </w:r>
+    </w:p>
+    <w:p>
+      <w:pPr>
+        <w:rPr/>
+      </w:pPr>
+      <w:r>
+        <w:rPr>
+          <w:rtl w:val="0"/>
+        </w:rPr>
+      </w:r>
+    </w:p>
+    <w:p>
+      <w:pPr>
+        <w:rPr/>
+      </w:pPr>
+      <w:r>
+        <w:rPr>
+          <w:rtl w:val="0"/>
+        </w:rPr>
+      </w:r>
+    </w:p>
+    <w:p>
+      <w:pPr>
+        <w:rPr/>
+      </w:pPr>
+      <w:r>
+        <w:rPr>
+          <w:rtl w:val="0"/>
+        </w:rPr>
+      </w:r>
+    </w:p>
+    <w:p>
+      <w:pPr>
+        <w:rPr/>
+      </w:pPr>
+      <w:r>
+        <w:rPr>
+          <w:rtl w:val="0"/>
+        </w:rPr>
+      </w:r>
+    </w:p>
+    <w:p>
+      <w:pPr>
+        <w:rPr/>
+      </w:pPr>
+      <w:r>
+        <w:rPr>
+          <w:rtl w:val="0"/>
+        </w:rPr>
+      </w:r>
+    </w:p>
+    <w:p>
+      <w:pPr>
+        <w:rPr/>
+      </w:pPr>
+      <w:r>
+        <w:rPr>
+          <w:rtl w:val="0"/>
+        </w:rPr>
+      </w:r>
+    </w:p>
+    <w:p>
+      <w:pPr>
+        <w:rPr/>
+      </w:pPr>
+      <w:r>
+        <w:rPr>
+          <w:rtl w:val="0"/>
+        </w:rPr>
+      </w:r>
+    </w:p>
+    <w:p>
+      <w:pPr>
         <w:widowControl w:val="1"/>
         <w:numPr>
           <w:ilvl w:val="1"/>
           <w:numId w:val="9"/>
         </w:numPr>
-        <w:pBdr>
-          <w:top w:space="0" w:sz="0" w:val="nil"/>
-          <w:left w:space="0" w:sz="0" w:val="nil"/>
-          <w:bottom w:space="0" w:sz="0" w:val="nil"/>
-          <w:right w:space="0" w:sz="0" w:val="nil"/>
-          <w:between w:space="0" w:sz="0" w:val="nil"/>
-        </w:pBdr>
-        <w:shd w:fill="auto" w:val="clear"/>
-        <w:spacing w:after="0" w:before="0" w:line="360" w:lineRule="auto"/>
-        <w:ind w:left="1440" w:right="0" w:hanging="360"/>
-        <w:jc w:val="left"/>
-        <w:rPr>
-          <w:rFonts w:ascii="Arial" w:cs="Arial" w:eastAsia="Arial" w:hAnsi="Arial"/>
+        <w:spacing w:line="360" w:lineRule="auto"/>
+        <w:ind w:left="1440" w:hanging="360"/>
+        <w:rPr>
           <w:b w:val="0"/>
           <w:bCs w:val="0"/>
-          <w:i w:val="0"/>
-          <w:iCs w:val="0"/>
-          <w:smallCaps w:val="0"/>
-          <w:strike w:val="0"/>
           <w:color w:val="ee0000"/>
           <w:sz w:val="20"/>
           <w:szCs w:val="20"/>
-          <w:u w:val="none"/>
-          <w:shd w:fill="auto" w:val="clear"/>
-          <w:vertAlign w:val="baseline"/>
-        </w:rPr>
-      </w:pPr>
-      <w:r>
-        <w:rPr>
-          <w:rFonts w:ascii="Arial" w:cs="Arial" w:eastAsia="Arial" w:hAnsi="Arial"/>
-          <w:b w:val="0"/>
-          <w:bCs w:val="0"/>
-          <w:i w:val="0"/>
-          <w:iCs w:val="0"/>
-          <w:smallCaps w:val="0"/>
-          <w:strike w:val="0"/>
-          <w:color w:val="000000"/>
+        </w:rPr>
+      </w:pPr>
+      <w:r>
+        <w:rPr>
+          <w:rFonts w:ascii="Arial" w:cs="Arial" w:eastAsia="Arial" w:hAnsi="Arial"/>
           <w:sz w:val="20"/>
           <w:szCs w:val="20"/>
-          <w:u w:val="none"/>
-          <w:shd w:fill="auto" w:val="clear"/>
-          <w:vertAlign w:val="baseline"/>
           <w:rtl w:val="0"/>
         </w:rPr>
         <w:t xml:space="preserve">Siga as telas que pedi na sprint</w:t>
       </w:r>
-      <w:r>
-        <w:rPr>
-          <w:rtl w:val="0"/>
-        </w:rPr>
-      </w:r>
-    </w:p>
-    <w:p>
-      <w:pPr>
-        <w:keepNext w:val="0"/>
-        <w:keepLines w:val="0"/>
-        <w:pageBreakBefore w:val="0"/>
+    </w:p>
+    <w:p>
+      <w:pPr>
+        <w:widowControl w:val="1"/>
+        <w:spacing w:line="360" w:lineRule="auto"/>
+        <w:rPr>
+          <w:rFonts w:ascii="Arial" w:cs="Arial" w:eastAsia="Arial" w:hAnsi="Arial"/>
+          <w:sz w:val="20"/>
+          <w:szCs w:val="20"/>
+        </w:rPr>
+      </w:pPr>
+      <w:r>
+        <w:rPr>
+          <w:rtl w:val="0"/>
+        </w:rPr>
+      </w:r>
+    </w:p>
+    <w:p>
+      <w:pPr>
+        <w:widowControl w:val="1"/>
+        <w:spacing w:line="360" w:lineRule="auto"/>
+        <w:rPr>
+          <w:rFonts w:ascii="Arial" w:cs="Arial" w:eastAsia="Arial" w:hAnsi="Arial"/>
+          <w:sz w:val="20"/>
+          <w:szCs w:val="20"/>
+        </w:rPr>
+      </w:pPr>
+      <w:r>
+        <w:rPr>
+          <w:rFonts w:ascii="Arial" w:cs="Arial" w:eastAsia="Arial" w:hAnsi="Arial"/>
+          <w:sz w:val="20"/>
+          <w:szCs w:val="20"/>
+        </w:rPr>
+        <w:drawing>
+          <wp:inline distB="114300" distT="114300" distL="114300" distR="114300">
+            <wp:extent cx="6247455" cy="6324600"/>
+            <wp:effectExtent b="0" l="0" r="0" t="0"/>
+            <wp:docPr id="8" name="image3.png"/>
+            <a:graphic>
+              <a:graphicData uri="http://schemas.openxmlformats.org/drawingml/2006/picture">
+                <pic:pic>
+                  <pic:nvPicPr>
+                    <pic:cNvPr id="0" name="image3.png"/>
+                    <pic:cNvPicPr preferRelativeResize="0"/>
+                  </pic:nvPicPr>
+                  <pic:blipFill>
+                    <a:blip r:embed="rId8"/>
+                    <a:srcRect b="0" l="0" r="0" t="0"/>
+                    <a:stretch>
+                      <a:fillRect/>
+                    </a:stretch>
+                  </pic:blipFill>
+                  <pic:spPr>
+                    <a:xfrm>
+                      <a:off x="0" y="0"/>
+                      <a:ext cx="6247455" cy="6324600"/>
+                    </a:xfrm>
+                    <a:prstGeom prst="rect"/>
+                    <a:ln/>
+                  </pic:spPr>
+                </pic:pic>
+              </a:graphicData>
+            </a:graphic>
+          </wp:inline>
+        </w:drawing>
+      </w:r>
+      <w:r>
+        <w:rPr>
+          <w:rtl w:val="0"/>
+        </w:rPr>
+      </w:r>
+    </w:p>
+    <w:p>
+      <w:pPr>
+        <w:widowControl w:val="1"/>
+        <w:spacing w:line="360" w:lineRule="auto"/>
+        <w:rPr>
+          <w:rFonts w:ascii="Arial" w:cs="Arial" w:eastAsia="Arial" w:hAnsi="Arial"/>
+          <w:sz w:val="20"/>
+          <w:szCs w:val="20"/>
+        </w:rPr>
+      </w:pPr>
+      <w:r>
+        <w:rPr>
+          <w:rtl w:val="0"/>
+        </w:rPr>
+      </w:r>
+    </w:p>
+    <w:p>
+      <w:pPr>
         <w:widowControl w:val="1"/>
         <w:numPr>
           <w:ilvl w:val="1"/>
           <w:numId w:val="9"/>
         </w:numPr>
-        <w:pBdr>
-          <w:top w:space="0" w:sz="0" w:val="nil"/>
-          <w:left w:space="0" w:sz="0" w:val="nil"/>
-          <w:bottom w:space="0" w:sz="0" w:val="nil"/>
-          <w:right w:space="0" w:sz="0" w:val="nil"/>
-          <w:between w:space="0" w:sz="0" w:val="nil"/>
-        </w:pBdr>
-        <w:shd w:fill="auto" w:val="clear"/>
-        <w:spacing w:after="0" w:before="0" w:line="360" w:lineRule="auto"/>
-        <w:ind w:left="1440" w:right="0" w:hanging="360"/>
-        <w:jc w:val="left"/>
-        <w:rPr>
-          <w:rFonts w:ascii="Arial" w:cs="Arial" w:eastAsia="Arial" w:hAnsi="Arial"/>
-          <w:b w:val="0"/>
-          <w:bCs w:val="0"/>
-          <w:i w:val="0"/>
-          <w:iCs w:val="0"/>
-          <w:smallCaps w:val="0"/>
-          <w:strike w:val="0"/>
+        <w:spacing w:line="360" w:lineRule="auto"/>
+        <w:ind w:left="1440" w:hanging="360"/>
+        <w:rPr>
+          <w:rFonts w:ascii="Arial" w:cs="Arial" w:eastAsia="Arial" w:hAnsi="Arial"/>
           <w:color w:val="ee0000"/>
           <w:sz w:val="20"/>
           <w:szCs w:val="20"/>
-          <w:u w:val="none"/>
-          <w:shd w:fill="auto" w:val="clear"/>
-          <w:vertAlign w:val="baseline"/>
-        </w:rPr>
-      </w:pPr>
-      <w:r>
-        <w:rPr>
-          <w:rFonts w:ascii="Arial" w:cs="Arial" w:eastAsia="Arial" w:hAnsi="Arial"/>
-          <w:b w:val="0"/>
-          <w:bCs w:val="0"/>
-          <w:i w:val="0"/>
-          <w:iCs w:val="0"/>
-          <w:smallCaps w:val="0"/>
-          <w:strike w:val="0"/>
-          <w:color w:val="000000"/>
+        </w:rPr>
+      </w:pPr>
+      <w:r>
+        <w:rPr>
+          <w:rFonts w:ascii="Arial" w:cs="Arial" w:eastAsia="Arial" w:hAnsi="Arial"/>
           <w:sz w:val="20"/>
           <w:szCs w:val="20"/>
-          <w:u w:val="none"/>
-          <w:shd w:fill="auto" w:val="clear"/>
-          <w:vertAlign w:val="baseline"/>
-          <w:rtl w:val="0"/>
-        </w:rPr>
-        <w:t xml:space="preserve">Siga as telas que pedi na sprint</w:t>
+          <w:rtl w:val="0"/>
+        </w:rPr>
+        <w:t xml:space="preserve">Siga as telas que pedi n</w:t>
+      </w:r>
+      <w:r>
+        <w:rPr>
+          <w:rFonts w:ascii="Arial" w:cs="Arial" w:eastAsia="Arial" w:hAnsi="Arial"/>
+          <w:sz w:val="20"/>
+          <w:szCs w:val="20"/>
+        </w:rPr>
+        <w:drawing>
+          <wp:inline distB="114300" distT="114300" distL="114300" distR="114300">
+            <wp:extent cx="4285664" cy="7343458"/>
+            <wp:effectExtent b="0" l="0" r="0" t="0"/>
+            <wp:docPr id="3" name="image4.png"/>
+            <a:graphic>
+              <a:graphicData uri="http://schemas.openxmlformats.org/drawingml/2006/picture">
+                <pic:pic>
+                  <pic:nvPicPr>
+                    <pic:cNvPr id="0" name="image4.png"/>
+                    <pic:cNvPicPr preferRelativeResize="0"/>
+                  </pic:nvPicPr>
+                  <pic:blipFill>
+                    <a:blip r:embed="rId9"/>
+                    <a:srcRect b="0" l="0" r="0" t="0"/>
+                    <a:stretch>
+                      <a:fillRect/>
+                    </a:stretch>
+                  </pic:blipFill>
+                  <pic:spPr>
+                    <a:xfrm>
+                      <a:off x="0" y="0"/>
+                      <a:ext cx="4285664" cy="7343458"/>
+                    </a:xfrm>
+                    <a:prstGeom prst="rect"/>
+                    <a:ln/>
+                  </pic:spPr>
+                </pic:pic>
+              </a:graphicData>
+            </a:graphic>
+          </wp:inline>
+        </w:drawing>
+      </w:r>
+      <w:r>
+        <w:rPr>
+          <w:rFonts w:ascii="Arial" w:cs="Arial" w:eastAsia="Arial" w:hAnsi="Arial"/>
+          <w:sz w:val="20"/>
+          <w:szCs w:val="20"/>
+          <w:rtl w:val="0"/>
+        </w:rPr>
+        <w:t xml:space="preserve">a sprint</w:t>
         <w:br w:type="textWrapping"/>
+      </w:r>
+      <w:r>
+        <w:rPr>
+          <w:rtl w:val="0"/>
+        </w:rPr>
       </w:r>
     </w:p>
     <w:p>
@@ -21038,8 +21345,23 @@
         <w:jc w:val="left"/>
         <w:rPr/>
       </w:pPr>
-      <w:bookmarkStart w:colFirst="0" w:colLast="0" w:name="_cmkf21m58t86" w:id="18"/>
-      <w:bookmarkEnd w:id="18"/>
+      <w:bookmarkStart w:colFirst="0" w:colLast="0" w:name="_pxy1jr1yro5b" w:id="19"/>
+      <w:bookmarkEnd w:id="19"/>
+      <w:r>
+        <w:rPr>
+          <w:rtl w:val="0"/>
+        </w:rPr>
+      </w:r>
+    </w:p>
+    <w:p>
+      <w:pPr>
+        <w:pStyle w:val="Heading2"/>
+        <w:spacing w:line="360" w:lineRule="auto"/>
+        <w:jc w:val="left"/>
+        <w:rPr/>
+      </w:pPr>
+      <w:bookmarkStart w:colFirst="0" w:colLast="0" w:name="_cmkf21m58t86" w:id="20"/>
+      <w:bookmarkEnd w:id="20"/>
       <w:r>
         <w:rPr>
           <w:rtl w:val="0"/>
@@ -21056,8 +21378,8 @@
           <w:vertAlign w:val="baseline"/>
         </w:rPr>
       </w:pPr>
-      <w:bookmarkStart w:colFirst="0" w:colLast="0" w:name="_grr5jw96msl8" w:id="19"/>
-      <w:bookmarkEnd w:id="19"/>
+      <w:bookmarkStart w:colFirst="0" w:colLast="0" w:name="_grr5jw96msl8" w:id="21"/>
+      <w:bookmarkEnd w:id="21"/>
       <w:r>
         <w:rPr>
           <w:vertAlign w:val="baseline"/>
@@ -21364,16 +21686,16 @@
           <wp:inline distB="114300" distT="114300" distL="114300" distR="114300">
             <wp:extent cx="6247455" cy="6819900"/>
             <wp:effectExtent b="0" l="0" r="0" t="0"/>
-            <wp:docPr id="1" name="image2.png"/>
+            <wp:docPr id="2" name="image6.png"/>
             <a:graphic>
               <a:graphicData uri="http://schemas.openxmlformats.org/drawingml/2006/picture">
                 <pic:pic>
                   <pic:nvPicPr>
-                    <pic:cNvPr id="0" name="image2.png"/>
+                    <pic:cNvPr id="0" name="image6.png"/>
                     <pic:cNvPicPr preferRelativeResize="0"/>
                   </pic:nvPicPr>
                   <pic:blipFill>
-                    <a:blip r:embed="rId6"/>
+                    <a:blip r:embed="rId10"/>
                     <a:srcRect b="0" l="0" r="0" t="0"/>
                     <a:stretch>
                       <a:fillRect/>
@@ -21447,8 +21769,8 @@
           <w:vertAlign w:val="baseline"/>
         </w:rPr>
       </w:pPr>
-      <w:bookmarkStart w:colFirst="0" w:colLast="0" w:name="_2sokdx5vccxy" w:id="20"/>
-      <w:bookmarkEnd w:id="20"/>
+      <w:bookmarkStart w:colFirst="0" w:colLast="0" w:name="_2sokdx5vccxy" w:id="22"/>
+      <w:bookmarkEnd w:id="22"/>
       <w:r>
         <w:rPr>
           <w:vertAlign w:val="baseline"/>
@@ -21673,16 +21995,16 @@
           <wp:inline distB="114300" distT="114300" distL="114300" distR="114300">
             <wp:extent cx="6247455" cy="3492500"/>
             <wp:effectExtent b="0" l="0" r="0" t="0"/>
-            <wp:docPr id="4" name="image3.png"/>
+            <wp:docPr id="6" name="image7.png"/>
             <a:graphic>
               <a:graphicData uri="http://schemas.openxmlformats.org/drawingml/2006/picture">
                 <pic:pic>
                   <pic:nvPicPr>
-                    <pic:cNvPr id="0" name="image3.png"/>
+                    <pic:cNvPr id="0" name="image7.png"/>
                     <pic:cNvPicPr preferRelativeResize="0"/>
                   </pic:nvPicPr>
                   <pic:blipFill>
-                    <a:blip r:embed="rId7"/>
+                    <a:blip r:embed="rId11"/>
                     <a:srcRect b="0" l="0" r="0" t="0"/>
                     <a:stretch>
                       <a:fillRect/>
@@ -21814,8 +22136,8 @@
           <w:vertAlign w:val="baseline"/>
         </w:rPr>
       </w:pPr>
-      <w:bookmarkStart w:colFirst="0" w:colLast="0" w:name="_6axr8zuzd2h6" w:id="21"/>
-      <w:bookmarkEnd w:id="21"/>
+      <w:bookmarkStart w:colFirst="0" w:colLast="0" w:name="_6axr8zuzd2h6" w:id="23"/>
+      <w:bookmarkEnd w:id="23"/>
       <w:r>
         <w:rPr>
           <w:vertAlign w:val="baseline"/>
@@ -21829,8 +22151,8 @@
         <w:pStyle w:val="Heading4"/>
         <w:rPr/>
       </w:pPr>
-      <w:bookmarkStart w:colFirst="0" w:colLast="0" w:name="_mdgyhmb35tbm" w:id="22"/>
-      <w:bookmarkEnd w:id="22"/>
+      <w:bookmarkStart w:colFirst="0" w:colLast="0" w:name="_mdgyhmb35tbm" w:id="24"/>
+      <w:bookmarkEnd w:id="24"/>
       <w:r>
         <w:rPr>
           <w:rtl w:val="0"/>
@@ -21858,16 +22180,16 @@
           <wp:inline distB="114300" distT="114300" distL="114300" distR="114300">
             <wp:extent cx="5048103" cy="6071575"/>
             <wp:effectExtent b="0" l="0" r="0" t="0"/>
-            <wp:docPr id="5" name="image5.png"/>
+            <wp:docPr id="7" name="image8.png"/>
             <a:graphic>
               <a:graphicData uri="http://schemas.openxmlformats.org/drawingml/2006/picture">
                 <pic:pic>
                   <pic:nvPicPr>
-                    <pic:cNvPr id="0" name="image5.png"/>
+                    <pic:cNvPr id="0" name="image8.png"/>
                     <pic:cNvPicPr preferRelativeResize="0"/>
                   </pic:nvPicPr>
                   <pic:blipFill>
-                    <a:blip r:embed="rId8"/>
+                    <a:blip r:embed="rId12"/>
                     <a:srcRect b="0" l="0" r="0" t="0"/>
                     <a:stretch>
                       <a:fillRect/>
@@ -21908,8 +22230,8 @@
         <w:pStyle w:val="Heading4"/>
         <w:rPr/>
       </w:pPr>
-      <w:bookmarkStart w:colFirst="0" w:colLast="0" w:name="_crspe34i2cnu" w:id="23"/>
-      <w:bookmarkEnd w:id="23"/>
+      <w:bookmarkStart w:colFirst="0" w:colLast="0" w:name="_crspe34i2cnu" w:id="25"/>
+      <w:bookmarkEnd w:id="25"/>
       <w:r>
         <w:rPr>
           <w:rtl w:val="0"/>
@@ -21951,16 +22273,16 @@
           <wp:inline distB="114300" distT="114300" distL="114300" distR="114300">
             <wp:extent cx="3514260" cy="6985975"/>
             <wp:effectExtent b="0" l="0" r="0" t="0"/>
-            <wp:docPr id="2" name="image6.png"/>
+            <wp:docPr id="4" name="image9.png"/>
             <a:graphic>
               <a:graphicData uri="http://schemas.openxmlformats.org/drawingml/2006/picture">
                 <pic:pic>
                   <pic:nvPicPr>
-                    <pic:cNvPr id="0" name="image6.png"/>
+                    <pic:cNvPr id="0" name="image9.png"/>
                     <pic:cNvPicPr preferRelativeResize="0"/>
                   </pic:nvPicPr>
                   <pic:blipFill>
-                    <a:blip r:embed="rId9"/>
+                    <a:blip r:embed="rId13"/>
                     <a:srcRect b="0" l="0" r="0" t="0"/>
                     <a:stretch>
                       <a:fillRect/>
@@ -22137,8 +22459,8 @@
         <w:spacing w:line="360" w:lineRule="auto"/>
         <w:rPr/>
       </w:pPr>
-      <w:bookmarkStart w:colFirst="0" w:colLast="0" w:name="_vduzg8fe7ol7" w:id="24"/>
-      <w:bookmarkEnd w:id="24"/>
+      <w:bookmarkStart w:colFirst="0" w:colLast="0" w:name="_vduzg8fe7ol7" w:id="26"/>
+      <w:bookmarkEnd w:id="26"/>
       <w:r>
         <w:rPr>
           <w:rtl w:val="0"/>
@@ -22271,16 +22593,16 @@
           <wp:inline distB="114300" distT="114300" distL="114300" distR="114300">
             <wp:extent cx="6247455" cy="4927600"/>
             <wp:effectExtent b="0" l="0" r="0" t="0"/>
-            <wp:docPr id="3" name="image4.png"/>
+            <wp:docPr id="5" name="image5.png"/>
             <a:graphic>
               <a:graphicData uri="http://schemas.openxmlformats.org/drawingml/2006/picture">
                 <pic:pic>
                   <pic:nvPicPr>
-                    <pic:cNvPr id="0" name="image4.png"/>
+                    <pic:cNvPr id="0" name="image5.png"/>
                     <pic:cNvPicPr preferRelativeResize="0"/>
                   </pic:nvPicPr>
                   <pic:blipFill>
-                    <a:blip r:embed="rId10"/>
+                    <a:blip r:embed="rId14"/>
                     <a:srcRect b="0" l="0" r="0" t="0"/>
                     <a:stretch>
                       <a:fillRect/>
@@ -22323,8 +22645,8 @@
         <w:jc w:val="left"/>
         <w:rPr/>
       </w:pPr>
-      <w:bookmarkStart w:colFirst="0" w:colLast="0" w:name="_qf64tbjx3ypu" w:id="25"/>
-      <w:bookmarkEnd w:id="25"/>
+      <w:bookmarkStart w:colFirst="0" w:colLast="0" w:name="_qf64tbjx3ypu" w:id="27"/>
+      <w:bookmarkEnd w:id="27"/>
       <w:r>
         <w:rPr>
           <w:rtl w:val="0"/>
@@ -22338,71 +22660,13 @@
         <w:jc w:val="left"/>
         <w:rPr/>
       </w:pPr>
-      <w:bookmarkStart w:colFirst="0" w:colLast="0" w:name="_b3efqfoji72n" w:id="26"/>
-      <w:bookmarkEnd w:id="26"/>
+      <w:bookmarkStart w:colFirst="0" w:colLast="0" w:name="_b3efqfoji72n" w:id="28"/>
+      <w:bookmarkEnd w:id="28"/>
       <w:r>
         <w:rPr>
           <w:rtl w:val="0"/>
         </w:rPr>
         <w:t xml:space="preserve">6. Casos de Testes</w:t>
-      </w:r>
-    </w:p>
-    <w:p>
-      <w:pPr>
-        <w:keepNext w:val="0"/>
-        <w:keepLines w:val="0"/>
-        <w:pageBreakBefore w:val="0"/>
-        <w:widowControl w:val="1"/>
-        <w:pBdr>
-          <w:top w:space="0" w:sz="0" w:val="nil"/>
-          <w:left w:space="0" w:sz="0" w:val="nil"/>
-          <w:bottom w:space="0" w:sz="0" w:val="nil"/>
-          <w:right w:space="0" w:sz="0" w:val="nil"/>
-          <w:between w:space="0" w:sz="0" w:val="nil"/>
-        </w:pBdr>
-        <w:shd w:fill="auto" w:val="clear"/>
-        <w:spacing w:after="0" w:before="0" w:line="240" w:lineRule="auto"/>
-        <w:ind w:left="0" w:right="0" w:firstLine="0"/>
-        <w:jc w:val="left"/>
-        <w:rPr>
-          <w:rFonts w:ascii="Times New Roman" w:cs="Times New Roman" w:eastAsia="Times New Roman" w:hAnsi="Times New Roman"/>
-          <w:b w:val="0"/>
-          <w:bCs w:val="0"/>
-          <w:i w:val="0"/>
-          <w:iCs w:val="0"/>
-          <w:smallCaps w:val="0"/>
-          <w:strike w:val="0"/>
-          <w:color w:val="4ea72e"/>
-          <w:sz w:val="24"/>
-          <w:szCs w:val="24"/>
-          <w:u w:val="none"/>
-          <w:shd w:fill="auto" w:val="clear"/>
-          <w:vertAlign w:val="baseline"/>
-        </w:rPr>
-      </w:pPr>
-      <w:r>
-        <w:rPr>
-          <w:rFonts w:ascii="Arial" w:cs="Arial" w:eastAsia="Arial" w:hAnsi="Arial"/>
-          <w:b w:val="0"/>
-          <w:bCs w:val="0"/>
-          <w:i w:val="0"/>
-          <w:iCs w:val="0"/>
-          <w:smallCaps w:val="0"/>
-          <w:strike w:val="0"/>
-          <w:color w:val="000000"/>
-          <w:sz w:val="20"/>
-          <w:szCs w:val="20"/>
-          <w:u w:val="none"/>
-          <w:shd w:fill="auto" w:val="clear"/>
-          <w:vertAlign w:val="baseline"/>
-          <w:rtl w:val="0"/>
-        </w:rPr>
-        <w:t xml:space="preserve">Ainda teremos aulas de testes</w:t>
-      </w:r>
-      <w:r>
-        <w:rPr>
-          <w:rtl w:val="0"/>
-        </w:rPr>
       </w:r>
     </w:p>
     <w:p>
@@ -22567,8 +22831,8 @@
         <w:jc w:val="left"/>
         <w:rPr/>
       </w:pPr>
-      <w:bookmarkStart w:colFirst="0" w:colLast="0" w:name="_9ovb7c0qln8" w:id="27"/>
-      <w:bookmarkEnd w:id="27"/>
+      <w:bookmarkStart w:colFirst="0" w:colLast="0" w:name="_9ovb7c0qln8" w:id="29"/>
+      <w:bookmarkEnd w:id="29"/>
       <w:r>
         <w:rPr>
           <w:rtl w:val="0"/>
@@ -22811,7 +23075,7 @@
       </w:r>
     </w:p>
     <w:sectPr>
-      <w:headerReference r:id="rId11" w:type="default"/>
+      <w:headerReference r:id="rId15" w:type="default"/>
       <w:pgSz w:h="16838" w:w="11906" w:orient="portrait"/>
       <w:pgMar w:bottom="1417" w:top="1417" w:left="1080" w:right="987" w:header="709" w:footer="720"/>
       <w:pgNumType w:start="1"/>
@@ -22876,12 +23140,12 @@
           <wp:extent cx="1951867" cy="592967"/>
           <wp:effectExtent b="0" l="0" r="0" t="0"/>
           <wp:wrapSquare wrapText="bothSides" distB="0" distT="0" distL="114300" distR="114300"/>
-          <wp:docPr id="6" name="image1.png"/>
+          <wp:docPr id="9" name="image2.png"/>
           <a:graphic>
             <a:graphicData uri="http://schemas.openxmlformats.org/drawingml/2006/picture">
               <pic:pic>
                 <pic:nvPicPr>
-                  <pic:cNvPr id="0" name="image1.png"/>
+                  <pic:cNvPr id="0" name="image2.png"/>
                   <pic:cNvPicPr preferRelativeResize="0"/>
                 </pic:nvPicPr>
                 <pic:blipFill>

</xml_diff>

<commit_message>
docs: README atualizado e sumario da ERS corrigido
</commit_message>
<xml_diff>
--- a/docs/entregas/CLTech - ERS.docx
+++ b/docs/entregas/CLTech - ERS.docx
@@ -334,7 +334,7 @@
         <w:pStyle w:val="Ttulo2"/>
         <w:spacing w:line="360" w:lineRule="auto"/>
       </w:pPr>
-      <w:bookmarkStart w:id="0" w:name="_Toc243721534"/>
+      <w:bookmarkStart w:id="0" w:name="_Toc243912807"/>
       <w:r>
         <w:t>Versão 1.1</w:t>
       </w:r>
@@ -2297,7 +2297,7 @@
           <w:r>
             <w:fldChar w:fldCharType="separate"/>
           </w:r>
-          <w:hyperlink w:anchor="_Toc243721534" w:history="1">
+          <w:hyperlink w:anchor="_Toc243912807" w:history="1">
             <w:r>
               <w:rPr>
                 <w:rStyle w:val="Hyperlink"/>
@@ -2324,7 +2324,7 @@
                 <w:noProof/>
                 <w:webHidden/>
               </w:rPr>
-              <w:instrText xml:space="preserve"> PAGEREF _Toc243721534 \h </w:instrText>
+              <w:instrText xml:space="preserve"> PAGEREF _Toc243912807 \h </w:instrText>
             </w:r>
             <w:r>
               <w:rPr>
@@ -2369,7 +2369,7 @@
               <w14:ligatures w14:val="standardContextual"/>
             </w:rPr>
           </w:pPr>
-          <w:hyperlink w:anchor="_Toc243721535" w:history="1">
+          <w:hyperlink w:anchor="_Toc243912808" w:history="1">
             <w:r>
               <w:rPr>
                 <w:rStyle w:val="Hyperlink"/>
@@ -2412,7 +2412,7 @@
                 <w:noProof/>
                 <w:webHidden/>
               </w:rPr>
-              <w:instrText xml:space="preserve"> PAGEREF _Toc243721535 \h </w:instrText>
+              <w:instrText xml:space="preserve"> PAGEREF _Toc243912808 \h </w:instrText>
             </w:r>
             <w:r>
               <w:rPr>
@@ -2457,7 +2457,7 @@
               <w14:ligatures w14:val="standardContextual"/>
             </w:rPr>
           </w:pPr>
-          <w:hyperlink w:anchor="_Toc243721536" w:history="1">
+          <w:hyperlink w:anchor="_Toc243912809" w:history="1">
             <w:r>
               <w:rPr>
                 <w:rStyle w:val="Hyperlink"/>
@@ -2500,7 +2500,7 @@
                 <w:noProof/>
                 <w:webHidden/>
               </w:rPr>
-              <w:instrText xml:space="preserve"> PAGEREF _Toc243721536 \h </w:instrText>
+              <w:instrText xml:space="preserve"> PAGEREF _Toc243912809 \h </w:instrText>
             </w:r>
             <w:r>
               <w:rPr>
@@ -2545,7 +2545,7 @@
               <w14:ligatures w14:val="standardContextual"/>
             </w:rPr>
           </w:pPr>
-          <w:hyperlink w:anchor="_Toc243721537" w:history="1">
+          <w:hyperlink w:anchor="_Toc243912810" w:history="1">
             <w:r>
               <w:rPr>
                 <w:rStyle w:val="Hyperlink"/>
@@ -2588,7 +2588,7 @@
                 <w:noProof/>
                 <w:webHidden/>
               </w:rPr>
-              <w:instrText xml:space="preserve"> PAGEREF _Toc243721537 \h </w:instrText>
+              <w:instrText xml:space="preserve"> PAGEREF _Toc243912810 \h </w:instrText>
             </w:r>
             <w:r>
               <w:rPr>
@@ -2633,7 +2633,7 @@
               <w14:ligatures w14:val="standardContextual"/>
             </w:rPr>
           </w:pPr>
-          <w:hyperlink w:anchor="_Toc243721538" w:history="1">
+          <w:hyperlink w:anchor="_Toc243912811" w:history="1">
             <w:r>
               <w:rPr>
                 <w:rStyle w:val="Hyperlink"/>
@@ -2676,7 +2676,7 @@
                 <w:noProof/>
                 <w:webHidden/>
               </w:rPr>
-              <w:instrText xml:space="preserve"> PAGEREF _Toc243721538 \h </w:instrText>
+              <w:instrText xml:space="preserve"> PAGEREF _Toc243912811 \h </w:instrText>
             </w:r>
             <w:r>
               <w:rPr>
@@ -2721,7 +2721,7 @@
               <w14:ligatures w14:val="standardContextual"/>
             </w:rPr>
           </w:pPr>
-          <w:hyperlink w:anchor="_Toc243721539" w:history="1">
+          <w:hyperlink w:anchor="_Toc243912812" w:history="1">
             <w:r>
               <w:rPr>
                 <w:rStyle w:val="Hyperlink"/>
@@ -2764,7 +2764,7 @@
                 <w:noProof/>
                 <w:webHidden/>
               </w:rPr>
-              <w:instrText xml:space="preserve"> PAGEREF _Toc243721539 \h </w:instrText>
+              <w:instrText xml:space="preserve"> PAGEREF _Toc243912812 \h </w:instrText>
             </w:r>
             <w:r>
               <w:rPr>
@@ -2808,7 +2808,7 @@
               <w14:ligatures w14:val="standardContextual"/>
             </w:rPr>
           </w:pPr>
-          <w:hyperlink w:anchor="_Toc243721540" w:history="1">
+          <w:hyperlink w:anchor="_Toc243912813" w:history="1">
             <w:r>
               <w:rPr>
                 <w:rStyle w:val="Hyperlink"/>
@@ -2835,7 +2835,7 @@
                 <w:noProof/>
                 <w:webHidden/>
               </w:rPr>
-              <w:instrText xml:space="preserve"> PAGEREF _Toc243721540 \h </w:instrText>
+              <w:instrText xml:space="preserve"> PAGEREF _Toc243912813 \h </w:instrText>
             </w:r>
             <w:r>
               <w:rPr>
@@ -2879,7 +2879,7 @@
               <w14:ligatures w14:val="standardContextual"/>
             </w:rPr>
           </w:pPr>
-          <w:hyperlink w:anchor="_Toc243721541" w:history="1">
+          <w:hyperlink w:anchor="_Toc243912814" w:history="1">
             <w:r>
               <w:rPr>
                 <w:rStyle w:val="Hyperlink"/>
@@ -2906,7 +2906,7 @@
                 <w:noProof/>
                 <w:webHidden/>
               </w:rPr>
-              <w:instrText xml:space="preserve"> PAGEREF _Toc243721541 \h </w:instrText>
+              <w:instrText xml:space="preserve"> PAGEREF _Toc243912814 \h </w:instrText>
             </w:r>
             <w:r>
               <w:rPr>
@@ -2950,7 +2950,7 @@
               <w14:ligatures w14:val="standardContextual"/>
             </w:rPr>
           </w:pPr>
-          <w:hyperlink w:anchor="_Toc243721542" w:history="1">
+          <w:hyperlink w:anchor="_Toc243912815" w:history="1">
             <w:r>
               <w:rPr>
                 <w:rStyle w:val="Hyperlink"/>
@@ -2977,7 +2977,7 @@
                 <w:noProof/>
                 <w:webHidden/>
               </w:rPr>
-              <w:instrText xml:space="preserve"> PAGEREF _Toc243721542 \h </w:instrText>
+              <w:instrText xml:space="preserve"> PAGEREF _Toc243912815 \h </w:instrText>
             </w:r>
             <w:r>
               <w:rPr>
@@ -3022,7 +3022,7 @@
               <w14:ligatures w14:val="standardContextual"/>
             </w:rPr>
           </w:pPr>
-          <w:hyperlink w:anchor="_Toc243721543" w:history="1">
+          <w:hyperlink w:anchor="_Toc243912816" w:history="1">
             <w:r>
               <w:rPr>
                 <w:rStyle w:val="Hyperlink"/>
@@ -3065,7 +3065,7 @@
                 <w:noProof/>
                 <w:webHidden/>
               </w:rPr>
-              <w:instrText xml:space="preserve"> PAGEREF _Toc243721543 \h </w:instrText>
+              <w:instrText xml:space="preserve"> PAGEREF _Toc243912816 \h </w:instrText>
             </w:r>
             <w:r>
               <w:rPr>
@@ -3110,7 +3110,7 @@
               <w14:ligatures w14:val="standardContextual"/>
             </w:rPr>
           </w:pPr>
-          <w:hyperlink w:anchor="_Toc243721544" w:history="1">
+          <w:hyperlink w:anchor="_Toc243912817" w:history="1">
             <w:r>
               <w:rPr>
                 <w:rStyle w:val="Hyperlink"/>
@@ -3153,7 +3153,7 @@
                 <w:noProof/>
                 <w:webHidden/>
               </w:rPr>
-              <w:instrText xml:space="preserve"> PAGEREF _Toc243721544 \h </w:instrText>
+              <w:instrText xml:space="preserve"> PAGEREF _Toc243912817 \h </w:instrText>
             </w:r>
             <w:r>
               <w:rPr>
@@ -3197,7 +3197,7 @@
               <w14:ligatures w14:val="standardContextual"/>
             </w:rPr>
           </w:pPr>
-          <w:hyperlink w:anchor="_Toc243721545" w:history="1">
+          <w:hyperlink w:anchor="_Toc243912818" w:history="1">
             <w:r>
               <w:rPr>
                 <w:rStyle w:val="Hyperlink"/>
@@ -3224,7 +3224,7 @@
                 <w:noProof/>
                 <w:webHidden/>
               </w:rPr>
-              <w:instrText xml:space="preserve"> PAGEREF _Toc243721545 \h </w:instrText>
+              <w:instrText xml:space="preserve"> PAGEREF _Toc243912818 \h </w:instrText>
             </w:r>
             <w:r>
               <w:rPr>
@@ -3268,7 +3268,7 @@
               <w14:ligatures w14:val="standardContextual"/>
             </w:rPr>
           </w:pPr>
-          <w:hyperlink w:anchor="_Toc243721546" w:history="1">
+          <w:hyperlink w:anchor="_Toc243912819" w:history="1">
             <w:r>
               <w:rPr>
                 <w:rStyle w:val="Hyperlink"/>
@@ -3295,7 +3295,7 @@
                 <w:noProof/>
                 <w:webHidden/>
               </w:rPr>
-              <w:instrText xml:space="preserve"> PAGEREF _Toc243721546 \h </w:instrText>
+              <w:instrText xml:space="preserve"> PAGEREF _Toc243912819 \h </w:instrText>
             </w:r>
             <w:r>
               <w:rPr>
@@ -3339,7 +3339,7 @@
               <w14:ligatures w14:val="standardContextual"/>
             </w:rPr>
           </w:pPr>
-          <w:hyperlink w:anchor="_Toc243721547" w:history="1">
+          <w:hyperlink w:anchor="_Toc243912820" w:history="1">
             <w:r>
               <w:rPr>
                 <w:rStyle w:val="Hyperlink"/>
@@ -3366,7 +3366,7 @@
                 <w:noProof/>
                 <w:webHidden/>
               </w:rPr>
-              <w:instrText xml:space="preserve"> PAGEREF _Toc243721547 \h </w:instrText>
+              <w:instrText xml:space="preserve"> PAGEREF _Toc243912820 \h </w:instrText>
             </w:r>
             <w:r>
               <w:rPr>
@@ -3410,7 +3410,7 @@
               <w14:ligatures w14:val="standardContextual"/>
             </w:rPr>
           </w:pPr>
-          <w:hyperlink w:anchor="_Toc243721548" w:history="1">
+          <w:hyperlink w:anchor="_Toc243912821" w:history="1">
             <w:r>
               <w:rPr>
                 <w:rStyle w:val="Hyperlink"/>
@@ -3437,7 +3437,7 @@
                 <w:noProof/>
                 <w:webHidden/>
               </w:rPr>
-              <w:instrText xml:space="preserve"> PAGEREF _Toc243721548 \h </w:instrText>
+              <w:instrText xml:space="preserve"> PAGEREF _Toc243912821 \h </w:instrText>
             </w:r>
             <w:r>
               <w:rPr>
@@ -3481,7 +3481,7 @@
               <w14:ligatures w14:val="standardContextual"/>
             </w:rPr>
           </w:pPr>
-          <w:hyperlink w:anchor="_Toc243721549" w:history="1">
+          <w:hyperlink w:anchor="_Toc243912822" w:history="1">
             <w:r>
               <w:rPr>
                 <w:rStyle w:val="Hyperlink"/>
@@ -3508,7 +3508,7 @@
                 <w:noProof/>
                 <w:webHidden/>
               </w:rPr>
-              <w:instrText xml:space="preserve"> PAGEREF _Toc243721549 \h </w:instrText>
+              <w:instrText xml:space="preserve"> PAGEREF _Toc243912822 \h </w:instrText>
             </w:r>
             <w:r>
               <w:rPr>
@@ -3552,7 +3552,7 @@
               <w14:ligatures w14:val="standardContextual"/>
             </w:rPr>
           </w:pPr>
-          <w:hyperlink w:anchor="_Toc243721550" w:history="1">
+          <w:hyperlink w:anchor="_Toc243912823" w:history="1">
             <w:r>
               <w:rPr>
                 <w:rStyle w:val="Hyperlink"/>
@@ -3579,7 +3579,7 @@
                 <w:noProof/>
                 <w:webHidden/>
               </w:rPr>
-              <w:instrText xml:space="preserve"> PAGEREF _Toc243721550 \h </w:instrText>
+              <w:instrText xml:space="preserve"> PAGEREF _Toc243912823 \h </w:instrText>
             </w:r>
             <w:r>
               <w:rPr>
@@ -3623,7 +3623,7 @@
               <w14:ligatures w14:val="standardContextual"/>
             </w:rPr>
           </w:pPr>
-          <w:hyperlink w:anchor="_Toc243721551" w:history="1">
+          <w:hyperlink w:anchor="_Toc243912824" w:history="1">
             <w:r>
               <w:rPr>
                 <w:rStyle w:val="Hyperlink"/>
@@ -3650,7 +3650,7 @@
                 <w:noProof/>
                 <w:webHidden/>
               </w:rPr>
-              <w:instrText xml:space="preserve"> PAGEREF _Toc243721551 \h </w:instrText>
+              <w:instrText xml:space="preserve"> PAGEREF _Toc243912824 \h </w:instrText>
             </w:r>
             <w:r>
               <w:rPr>
@@ -3694,7 +3694,7 @@
               <w14:ligatures w14:val="standardContextual"/>
             </w:rPr>
           </w:pPr>
-          <w:hyperlink w:anchor="_Toc243721552" w:history="1">
+          <w:hyperlink w:anchor="_Toc243912825" w:history="1">
             <w:r>
               <w:rPr>
                 <w:rStyle w:val="Hyperlink"/>
@@ -3721,7 +3721,7 @@
                 <w:noProof/>
                 <w:webHidden/>
               </w:rPr>
-              <w:instrText xml:space="preserve"> PAGEREF _Toc243721552 \h </w:instrText>
+              <w:instrText xml:space="preserve"> PAGEREF _Toc243912825 \h </w:instrText>
             </w:r>
             <w:r>
               <w:rPr>
@@ -3765,7 +3765,14 @@
               <w14:ligatures w14:val="standardContextual"/>
             </w:rPr>
           </w:pPr>
-          <w:hyperlink w:anchor="_Toc243721553" w:history="1">
+          <w:hyperlink w:anchor="_Toc243912826" w:history="1">
+            <w:r>
+              <w:rPr>
+                <w:rStyle w:val="Hyperlink"/>
+                <w:noProof/>
+              </w:rPr>
+              <w:t>5. Diagramas UML</w:t>
+            </w:r>
             <w:r>
               <w:rPr>
                 <w:noProof/>
@@ -3785,7 +3792,7 @@
                 <w:noProof/>
                 <w:webHidden/>
               </w:rPr>
-              <w:instrText xml:space="preserve"> PAGEREF _Toc243721553 \h </w:instrText>
+              <w:instrText xml:space="preserve"> PAGEREF _Toc243912826 \h </w:instrText>
             </w:r>
             <w:r>
               <w:rPr>
@@ -3805,7 +3812,717 @@
                 <w:noProof/>
                 <w:webHidden/>
               </w:rPr>
-              <w:t>25</w:t>
+              <w:t>28</w:t>
+            </w:r>
+            <w:r>
+              <w:rPr>
+                <w:noProof/>
+                <w:webHidden/>
+              </w:rPr>
+              <w:fldChar w:fldCharType="end"/>
+            </w:r>
+          </w:hyperlink>
+        </w:p>
+        <w:p>
+          <w:pPr>
+            <w:pStyle w:val="Sumrio3"/>
+            <w:tabs>
+              <w:tab w:val="right" w:leader="dot" w:pos="9829"/>
+            </w:tabs>
+            <w:rPr>
+              <w:rFonts w:asciiTheme="minorHAnsi" w:eastAsiaTheme="minorEastAsia" w:hAnsiTheme="minorHAnsi" w:cstheme="minorBidi"/>
+              <w:noProof/>
+              <w:kern w:val="2"/>
+              <w14:ligatures w14:val="standardContextual"/>
+            </w:rPr>
+          </w:pPr>
+          <w:hyperlink w:anchor="_Toc243912827" w:history="1">
+            <w:r>
+              <w:rPr>
+                <w:rStyle w:val="Hyperlink"/>
+                <w:noProof/>
+              </w:rPr>
+              <w:t>5.1 Diagrama de Casos de Uso</w:t>
+            </w:r>
+            <w:r>
+              <w:rPr>
+                <w:noProof/>
+                <w:webHidden/>
+              </w:rPr>
+              <w:tab/>
+            </w:r>
+            <w:r>
+              <w:rPr>
+                <w:noProof/>
+                <w:webHidden/>
+              </w:rPr>
+              <w:fldChar w:fldCharType="begin"/>
+            </w:r>
+            <w:r>
+              <w:rPr>
+                <w:noProof/>
+                <w:webHidden/>
+              </w:rPr>
+              <w:instrText xml:space="preserve"> PAGEREF _Toc243912827 \h </w:instrText>
+            </w:r>
+            <w:r>
+              <w:rPr>
+                <w:noProof/>
+                <w:webHidden/>
+              </w:rPr>
+            </w:r>
+            <w:r>
+              <w:rPr>
+                <w:noProof/>
+                <w:webHidden/>
+              </w:rPr>
+              <w:fldChar w:fldCharType="separate"/>
+            </w:r>
+            <w:r>
+              <w:rPr>
+                <w:noProof/>
+                <w:webHidden/>
+              </w:rPr>
+              <w:t>28</w:t>
+            </w:r>
+            <w:r>
+              <w:rPr>
+                <w:noProof/>
+                <w:webHidden/>
+              </w:rPr>
+              <w:fldChar w:fldCharType="end"/>
+            </w:r>
+          </w:hyperlink>
+        </w:p>
+        <w:p>
+          <w:pPr>
+            <w:pStyle w:val="Sumrio3"/>
+            <w:tabs>
+              <w:tab w:val="right" w:leader="dot" w:pos="9829"/>
+            </w:tabs>
+            <w:rPr>
+              <w:rFonts w:asciiTheme="minorHAnsi" w:eastAsiaTheme="minorEastAsia" w:hAnsiTheme="minorHAnsi" w:cstheme="minorBidi"/>
+              <w:noProof/>
+              <w:kern w:val="2"/>
+              <w14:ligatures w14:val="standardContextual"/>
+            </w:rPr>
+          </w:pPr>
+          <w:hyperlink w:anchor="_Toc243912828" w:history="1">
+            <w:r>
+              <w:rPr>
+                <w:rStyle w:val="Hyperlink"/>
+                <w:noProof/>
+              </w:rPr>
+              <w:t>5.2 Diagrama de Classes</w:t>
+            </w:r>
+            <w:r>
+              <w:rPr>
+                <w:noProof/>
+                <w:webHidden/>
+              </w:rPr>
+              <w:tab/>
+            </w:r>
+            <w:r>
+              <w:rPr>
+                <w:noProof/>
+                <w:webHidden/>
+              </w:rPr>
+              <w:fldChar w:fldCharType="begin"/>
+            </w:r>
+            <w:r>
+              <w:rPr>
+                <w:noProof/>
+                <w:webHidden/>
+              </w:rPr>
+              <w:instrText xml:space="preserve"> PAGEREF _Toc243912828 \h </w:instrText>
+            </w:r>
+            <w:r>
+              <w:rPr>
+                <w:noProof/>
+                <w:webHidden/>
+              </w:rPr>
+            </w:r>
+            <w:r>
+              <w:rPr>
+                <w:noProof/>
+                <w:webHidden/>
+              </w:rPr>
+              <w:fldChar w:fldCharType="separate"/>
+            </w:r>
+            <w:r>
+              <w:rPr>
+                <w:noProof/>
+                <w:webHidden/>
+              </w:rPr>
+              <w:t>30</w:t>
+            </w:r>
+            <w:r>
+              <w:rPr>
+                <w:noProof/>
+                <w:webHidden/>
+              </w:rPr>
+              <w:fldChar w:fldCharType="end"/>
+            </w:r>
+          </w:hyperlink>
+        </w:p>
+        <w:p>
+          <w:pPr>
+            <w:pStyle w:val="Sumrio3"/>
+            <w:tabs>
+              <w:tab w:val="right" w:leader="dot" w:pos="9829"/>
+            </w:tabs>
+            <w:rPr>
+              <w:rFonts w:asciiTheme="minorHAnsi" w:eastAsiaTheme="minorEastAsia" w:hAnsiTheme="minorHAnsi" w:cstheme="minorBidi"/>
+              <w:noProof/>
+              <w:kern w:val="2"/>
+              <w14:ligatures w14:val="standardContextual"/>
+            </w:rPr>
+          </w:pPr>
+          <w:hyperlink w:anchor="_Toc243912829" w:history="1">
+            <w:r>
+              <w:rPr>
+                <w:rStyle w:val="Hyperlink"/>
+                <w:noProof/>
+              </w:rPr>
+              <w:t>5.3 Diagrama de Sequência</w:t>
+            </w:r>
+            <w:r>
+              <w:rPr>
+                <w:noProof/>
+                <w:webHidden/>
+              </w:rPr>
+              <w:tab/>
+            </w:r>
+            <w:r>
+              <w:rPr>
+                <w:noProof/>
+                <w:webHidden/>
+              </w:rPr>
+              <w:fldChar w:fldCharType="begin"/>
+            </w:r>
+            <w:r>
+              <w:rPr>
+                <w:noProof/>
+                <w:webHidden/>
+              </w:rPr>
+              <w:instrText xml:space="preserve"> PAGEREF _Toc243912829 \h </w:instrText>
+            </w:r>
+            <w:r>
+              <w:rPr>
+                <w:noProof/>
+                <w:webHidden/>
+              </w:rPr>
+            </w:r>
+            <w:r>
+              <w:rPr>
+                <w:noProof/>
+                <w:webHidden/>
+              </w:rPr>
+              <w:fldChar w:fldCharType="separate"/>
+            </w:r>
+            <w:r>
+              <w:rPr>
+                <w:noProof/>
+                <w:webHidden/>
+              </w:rPr>
+              <w:t>31</w:t>
+            </w:r>
+            <w:r>
+              <w:rPr>
+                <w:noProof/>
+                <w:webHidden/>
+              </w:rPr>
+              <w:fldChar w:fldCharType="end"/>
+            </w:r>
+          </w:hyperlink>
+        </w:p>
+        <w:p>
+          <w:pPr>
+            <w:pStyle w:val="Sumrio4"/>
+            <w:tabs>
+              <w:tab w:val="right" w:leader="dot" w:pos="9829"/>
+            </w:tabs>
+            <w:rPr>
+              <w:rFonts w:asciiTheme="minorHAnsi" w:eastAsiaTheme="minorEastAsia" w:hAnsiTheme="minorHAnsi" w:cstheme="minorBidi"/>
+              <w:noProof/>
+              <w:kern w:val="2"/>
+              <w14:ligatures w14:val="standardContextual"/>
+            </w:rPr>
+          </w:pPr>
+          <w:hyperlink w:anchor="_Toc243912830" w:history="1">
+            <w:r>
+              <w:rPr>
+                <w:rStyle w:val="Hyperlink"/>
+                <w:noProof/>
+              </w:rPr>
+              <w:t>5.3.1 Diagrama de Sequência [RF 04] – Criar Vaga e Configurar Pipeline de Seleção.</w:t>
+            </w:r>
+            <w:r>
+              <w:rPr>
+                <w:noProof/>
+                <w:webHidden/>
+              </w:rPr>
+              <w:tab/>
+            </w:r>
+            <w:r>
+              <w:rPr>
+                <w:noProof/>
+                <w:webHidden/>
+              </w:rPr>
+              <w:fldChar w:fldCharType="begin"/>
+            </w:r>
+            <w:r>
+              <w:rPr>
+                <w:noProof/>
+                <w:webHidden/>
+              </w:rPr>
+              <w:instrText xml:space="preserve"> PAGEREF _Toc243912830 \h </w:instrText>
+            </w:r>
+            <w:r>
+              <w:rPr>
+                <w:noProof/>
+                <w:webHidden/>
+              </w:rPr>
+            </w:r>
+            <w:r>
+              <w:rPr>
+                <w:noProof/>
+                <w:webHidden/>
+              </w:rPr>
+              <w:fldChar w:fldCharType="separate"/>
+            </w:r>
+            <w:r>
+              <w:rPr>
+                <w:noProof/>
+                <w:webHidden/>
+              </w:rPr>
+              <w:t>31</w:t>
+            </w:r>
+            <w:r>
+              <w:rPr>
+                <w:noProof/>
+                <w:webHidden/>
+              </w:rPr>
+              <w:fldChar w:fldCharType="end"/>
+            </w:r>
+          </w:hyperlink>
+        </w:p>
+        <w:p>
+          <w:pPr>
+            <w:pStyle w:val="Sumrio4"/>
+            <w:tabs>
+              <w:tab w:val="right" w:leader="dot" w:pos="9829"/>
+            </w:tabs>
+            <w:rPr>
+              <w:rFonts w:asciiTheme="minorHAnsi" w:eastAsiaTheme="minorEastAsia" w:hAnsiTheme="minorHAnsi" w:cstheme="minorBidi"/>
+              <w:noProof/>
+              <w:kern w:val="2"/>
+              <w14:ligatures w14:val="standardContextual"/>
+            </w:rPr>
+          </w:pPr>
+          <w:hyperlink w:anchor="_Toc243912831" w:history="1">
+            <w:r>
+              <w:rPr>
+                <w:rStyle w:val="Hyperlink"/>
+                <w:noProof/>
+              </w:rPr>
+              <w:t>5.3.2 Diagrama de Sequência [RF 02, RF 03, RN001] – Completar Perfil, Candidatar-se e Triagem Automática</w:t>
+            </w:r>
+            <w:r>
+              <w:rPr>
+                <w:noProof/>
+                <w:webHidden/>
+              </w:rPr>
+              <w:tab/>
+            </w:r>
+            <w:r>
+              <w:rPr>
+                <w:noProof/>
+                <w:webHidden/>
+              </w:rPr>
+              <w:fldChar w:fldCharType="begin"/>
+            </w:r>
+            <w:r>
+              <w:rPr>
+                <w:noProof/>
+                <w:webHidden/>
+              </w:rPr>
+              <w:instrText xml:space="preserve"> PAGEREF _Toc243912831 \h </w:instrText>
+            </w:r>
+            <w:r>
+              <w:rPr>
+                <w:noProof/>
+                <w:webHidden/>
+              </w:rPr>
+            </w:r>
+            <w:r>
+              <w:rPr>
+                <w:noProof/>
+                <w:webHidden/>
+              </w:rPr>
+              <w:fldChar w:fldCharType="separate"/>
+            </w:r>
+            <w:r>
+              <w:rPr>
+                <w:noProof/>
+                <w:webHidden/>
+              </w:rPr>
+              <w:t>32</w:t>
+            </w:r>
+            <w:r>
+              <w:rPr>
+                <w:noProof/>
+                <w:webHidden/>
+              </w:rPr>
+              <w:fldChar w:fldCharType="end"/>
+            </w:r>
+          </w:hyperlink>
+        </w:p>
+        <w:p>
+          <w:pPr>
+            <w:pStyle w:val="Sumrio4"/>
+            <w:tabs>
+              <w:tab w:val="right" w:leader="dot" w:pos="9829"/>
+            </w:tabs>
+            <w:rPr>
+              <w:rFonts w:asciiTheme="minorHAnsi" w:eastAsiaTheme="minorEastAsia" w:hAnsiTheme="minorHAnsi" w:cstheme="minorBidi"/>
+              <w:noProof/>
+              <w:kern w:val="2"/>
+              <w14:ligatures w14:val="standardContextual"/>
+            </w:rPr>
+          </w:pPr>
+          <w:hyperlink w:anchor="_Toc243912832" w:history="1">
+            <w:r>
+              <w:rPr>
+                <w:rStyle w:val="Hyperlink"/>
+                <w:noProof/>
+              </w:rPr>
+              <w:t>5.3.3 Diagrama de Sequência [RF 05, RF 06] – Teste de Código e Correção Automática</w:t>
+            </w:r>
+            <w:r>
+              <w:rPr>
+                <w:noProof/>
+                <w:webHidden/>
+              </w:rPr>
+              <w:tab/>
+            </w:r>
+            <w:r>
+              <w:rPr>
+                <w:noProof/>
+                <w:webHidden/>
+              </w:rPr>
+              <w:fldChar w:fldCharType="begin"/>
+            </w:r>
+            <w:r>
+              <w:rPr>
+                <w:noProof/>
+                <w:webHidden/>
+              </w:rPr>
+              <w:instrText xml:space="preserve"> PAGEREF _Toc243912832 \h </w:instrText>
+            </w:r>
+            <w:r>
+              <w:rPr>
+                <w:noProof/>
+                <w:webHidden/>
+              </w:rPr>
+            </w:r>
+            <w:r>
+              <w:rPr>
+                <w:noProof/>
+                <w:webHidden/>
+              </w:rPr>
+              <w:fldChar w:fldCharType="separate"/>
+            </w:r>
+            <w:r>
+              <w:rPr>
+                <w:noProof/>
+                <w:webHidden/>
+              </w:rPr>
+              <w:t>33</w:t>
+            </w:r>
+            <w:r>
+              <w:rPr>
+                <w:noProof/>
+                <w:webHidden/>
+              </w:rPr>
+              <w:fldChar w:fldCharType="end"/>
+            </w:r>
+          </w:hyperlink>
+        </w:p>
+        <w:p>
+          <w:pPr>
+            <w:pStyle w:val="Sumrio3"/>
+            <w:tabs>
+              <w:tab w:val="right" w:leader="dot" w:pos="9829"/>
+            </w:tabs>
+            <w:rPr>
+              <w:rFonts w:asciiTheme="minorHAnsi" w:eastAsiaTheme="minorEastAsia" w:hAnsiTheme="minorHAnsi" w:cstheme="minorBidi"/>
+              <w:noProof/>
+              <w:kern w:val="2"/>
+              <w14:ligatures w14:val="standardContextual"/>
+            </w:rPr>
+          </w:pPr>
+          <w:hyperlink w:anchor="_Toc243912833" w:history="1">
+            <w:r>
+              <w:rPr>
+                <w:rStyle w:val="Hyperlink"/>
+                <w:noProof/>
+              </w:rPr>
+              <w:t>5.4 Diagrama de Entidade e Relacionamento (DER)</w:t>
+            </w:r>
+            <w:r>
+              <w:rPr>
+                <w:noProof/>
+                <w:webHidden/>
+              </w:rPr>
+              <w:tab/>
+            </w:r>
+            <w:r>
+              <w:rPr>
+                <w:noProof/>
+                <w:webHidden/>
+              </w:rPr>
+              <w:fldChar w:fldCharType="begin"/>
+            </w:r>
+            <w:r>
+              <w:rPr>
+                <w:noProof/>
+                <w:webHidden/>
+              </w:rPr>
+              <w:instrText xml:space="preserve"> PAGEREF _Toc243912833 \h </w:instrText>
+            </w:r>
+            <w:r>
+              <w:rPr>
+                <w:noProof/>
+                <w:webHidden/>
+              </w:rPr>
+            </w:r>
+            <w:r>
+              <w:rPr>
+                <w:noProof/>
+                <w:webHidden/>
+              </w:rPr>
+              <w:fldChar w:fldCharType="separate"/>
+            </w:r>
+            <w:r>
+              <w:rPr>
+                <w:noProof/>
+                <w:webHidden/>
+              </w:rPr>
+              <w:t>34</w:t>
+            </w:r>
+            <w:r>
+              <w:rPr>
+                <w:noProof/>
+                <w:webHidden/>
+              </w:rPr>
+              <w:fldChar w:fldCharType="end"/>
+            </w:r>
+          </w:hyperlink>
+        </w:p>
+        <w:p>
+          <w:pPr>
+            <w:pStyle w:val="Sumrio3"/>
+            <w:tabs>
+              <w:tab w:val="right" w:leader="dot" w:pos="9829"/>
+            </w:tabs>
+            <w:rPr>
+              <w:rFonts w:asciiTheme="minorHAnsi" w:eastAsiaTheme="minorEastAsia" w:hAnsiTheme="minorHAnsi" w:cstheme="minorBidi"/>
+              <w:noProof/>
+              <w:kern w:val="2"/>
+              <w14:ligatures w14:val="standardContextual"/>
+            </w:rPr>
+          </w:pPr>
+          <w:hyperlink w:anchor="_Toc243912834" w:history="1">
+            <w:r>
+              <w:rPr>
+                <w:rStyle w:val="Hyperlink"/>
+                <w:noProof/>
+              </w:rPr>
+              <w:t>5.5 Diagramas de Atividade</w:t>
+            </w:r>
+            <w:r>
+              <w:rPr>
+                <w:noProof/>
+                <w:webHidden/>
+              </w:rPr>
+              <w:tab/>
+            </w:r>
+            <w:r>
+              <w:rPr>
+                <w:noProof/>
+                <w:webHidden/>
+              </w:rPr>
+              <w:fldChar w:fldCharType="begin"/>
+            </w:r>
+            <w:r>
+              <w:rPr>
+                <w:noProof/>
+                <w:webHidden/>
+              </w:rPr>
+              <w:instrText xml:space="preserve"> PAGEREF _Toc243912834 \h </w:instrText>
+            </w:r>
+            <w:r>
+              <w:rPr>
+                <w:noProof/>
+                <w:webHidden/>
+              </w:rPr>
+            </w:r>
+            <w:r>
+              <w:rPr>
+                <w:noProof/>
+                <w:webHidden/>
+              </w:rPr>
+              <w:fldChar w:fldCharType="separate"/>
+            </w:r>
+            <w:r>
+              <w:rPr>
+                <w:noProof/>
+                <w:webHidden/>
+              </w:rPr>
+              <w:t>35</w:t>
+            </w:r>
+            <w:r>
+              <w:rPr>
+                <w:noProof/>
+                <w:webHidden/>
+              </w:rPr>
+              <w:fldChar w:fldCharType="end"/>
+            </w:r>
+          </w:hyperlink>
+        </w:p>
+        <w:p>
+          <w:pPr>
+            <w:pStyle w:val="Sumrio4"/>
+            <w:tabs>
+              <w:tab w:val="right" w:leader="dot" w:pos="9829"/>
+            </w:tabs>
+            <w:rPr>
+              <w:rFonts w:asciiTheme="minorHAnsi" w:eastAsiaTheme="minorEastAsia" w:hAnsiTheme="minorHAnsi" w:cstheme="minorBidi"/>
+              <w:noProof/>
+              <w:kern w:val="2"/>
+              <w14:ligatures w14:val="standardContextual"/>
+            </w:rPr>
+          </w:pPr>
+          <w:hyperlink w:anchor="_Toc243912835" w:history="1">
+            <w:r>
+              <w:rPr>
+                <w:rStyle w:val="Hyperlink"/>
+                <w:noProof/>
+              </w:rPr>
+              <w:t>5.5.1 Diagrama de Atividade [RF 03, RN001] – Candidatura a uma Vaga</w:t>
+            </w:r>
+            <w:r>
+              <w:rPr>
+                <w:noProof/>
+                <w:webHidden/>
+              </w:rPr>
+              <w:tab/>
+            </w:r>
+            <w:r>
+              <w:rPr>
+                <w:noProof/>
+                <w:webHidden/>
+              </w:rPr>
+              <w:fldChar w:fldCharType="begin"/>
+            </w:r>
+            <w:r>
+              <w:rPr>
+                <w:noProof/>
+                <w:webHidden/>
+              </w:rPr>
+              <w:instrText xml:space="preserve"> PAGEREF _Toc243912835 \h </w:instrText>
+            </w:r>
+            <w:r>
+              <w:rPr>
+                <w:noProof/>
+                <w:webHidden/>
+              </w:rPr>
+            </w:r>
+            <w:r>
+              <w:rPr>
+                <w:noProof/>
+                <w:webHidden/>
+              </w:rPr>
+              <w:fldChar w:fldCharType="separate"/>
+            </w:r>
+            <w:r>
+              <w:rPr>
+                <w:noProof/>
+                <w:webHidden/>
+              </w:rPr>
+              <w:t>35</w:t>
+            </w:r>
+            <w:r>
+              <w:rPr>
+                <w:noProof/>
+                <w:webHidden/>
+              </w:rPr>
+              <w:fldChar w:fldCharType="end"/>
+            </w:r>
+          </w:hyperlink>
+        </w:p>
+        <w:p>
+          <w:pPr>
+            <w:pStyle w:val="Sumrio4"/>
+            <w:tabs>
+              <w:tab w:val="right" w:leader="dot" w:pos="9829"/>
+            </w:tabs>
+            <w:rPr>
+              <w:rFonts w:asciiTheme="minorHAnsi" w:eastAsiaTheme="minorEastAsia" w:hAnsiTheme="minorHAnsi" w:cstheme="minorBidi"/>
+              <w:noProof/>
+              <w:kern w:val="2"/>
+              <w14:ligatures w14:val="standardContextual"/>
+            </w:rPr>
+          </w:pPr>
+          <w:hyperlink w:anchor="_Toc243912836" w:history="1">
+            <w:r>
+              <w:rPr>
+                <w:rStyle w:val="Hyperlink"/>
+                <w:noProof/>
+              </w:rPr>
+              <w:t>5.5.2 Diagrama de Atividade [RF 05, RF 06] – Teste de Código e Correção Automática</w:t>
+            </w:r>
+            <w:r>
+              <w:rPr>
+                <w:noProof/>
+                <w:webHidden/>
+              </w:rPr>
+              <w:tab/>
+            </w:r>
+            <w:r>
+              <w:rPr>
+                <w:noProof/>
+                <w:webHidden/>
+              </w:rPr>
+              <w:fldChar w:fldCharType="begin"/>
+            </w:r>
+            <w:r>
+              <w:rPr>
+                <w:noProof/>
+                <w:webHidden/>
+              </w:rPr>
+              <w:instrText xml:space="preserve"> PAGEREF _Toc243912836 \h </w:instrText>
+            </w:r>
+            <w:r>
+              <w:rPr>
+                <w:noProof/>
+                <w:webHidden/>
+              </w:rPr>
+            </w:r>
+            <w:r>
+              <w:rPr>
+                <w:noProof/>
+                <w:webHidden/>
+              </w:rPr>
+              <w:fldChar w:fldCharType="separate"/>
+            </w:r>
+            <w:r>
+              <w:rPr>
+                <w:noProof/>
+                <w:webHidden/>
+              </w:rPr>
+              <w:t>36</w:t>
             </w:r>
             <w:r>
               <w:rPr>
@@ -3829,13 +4546,13 @@
               <w14:ligatures w14:val="standardContextual"/>
             </w:rPr>
           </w:pPr>
-          <w:hyperlink w:anchor="_Toc243721554" w:history="1">
+          <w:hyperlink w:anchor="_Toc243912837" w:history="1">
             <w:r>
               <w:rPr>
                 <w:rStyle w:val="Hyperlink"/>
                 <w:noProof/>
               </w:rPr>
-              <w:t>5. Diagramas UML</w:t>
+              <w:t>6. Casos de Testes</w:t>
             </w:r>
             <w:r>
               <w:rPr>
@@ -3856,7 +4573,7 @@
                 <w:noProof/>
                 <w:webHidden/>
               </w:rPr>
-              <w:instrText xml:space="preserve"> PAGEREF _Toc243721554 \h </w:instrText>
+              <w:instrText xml:space="preserve"> PAGEREF _Toc243912837 \h </w:instrText>
             </w:r>
             <w:r>
               <w:rPr>
@@ -3876,7 +4593,7 @@
                 <w:noProof/>
                 <w:webHidden/>
               </w:rPr>
-              <w:t>28</w:t>
+              <w:t>36</w:t>
             </w:r>
             <w:r>
               <w:rPr>
@@ -3900,13 +4617,13 @@
               <w14:ligatures w14:val="standardContextual"/>
             </w:rPr>
           </w:pPr>
-          <w:hyperlink w:anchor="_Toc243721555" w:history="1">
+          <w:hyperlink w:anchor="_Toc243912838" w:history="1">
             <w:r>
               <w:rPr>
                 <w:rStyle w:val="Hyperlink"/>
                 <w:noProof/>
               </w:rPr>
-              <w:t>5.1 Diagrama de Casos de Uso</w:t>
+              <w:t>Apêndice A – Documento da SAGA SENAI</w:t>
             </w:r>
             <w:r>
               <w:rPr>
@@ -3927,7 +4644,7 @@
                 <w:noProof/>
                 <w:webHidden/>
               </w:rPr>
-              <w:instrText xml:space="preserve"> PAGEREF _Toc243721555 \h </w:instrText>
+              <w:instrText xml:space="preserve"> PAGEREF _Toc243912838 \h </w:instrText>
             </w:r>
             <w:r>
               <w:rPr>
@@ -3947,7 +4664,7 @@
                 <w:noProof/>
                 <w:webHidden/>
               </w:rPr>
-              <w:t>28</w:t>
+              <w:t>36</w:t>
             </w:r>
             <w:r>
               <w:rPr>
@@ -3971,13 +4688,13 @@
               <w14:ligatures w14:val="standardContextual"/>
             </w:rPr>
           </w:pPr>
-          <w:hyperlink w:anchor="_Toc243721556" w:history="1">
+          <w:hyperlink w:anchor="_Toc243912839" w:history="1">
             <w:r>
               <w:rPr>
                 <w:rStyle w:val="Hyperlink"/>
                 <w:noProof/>
               </w:rPr>
-              <w:t>5.2 Diagrama de Classes</w:t>
+              <w:t>Apêndice B – Registro de decisões, divergências, dificuldades e mudanças de escopo (Sprint 2)</w:t>
             </w:r>
             <w:r>
               <w:rPr>
@@ -3998,7 +4715,7 @@
                 <w:noProof/>
                 <w:webHidden/>
               </w:rPr>
-              <w:instrText xml:space="preserve"> PAGEREF _Toc243721556 \h </w:instrText>
+              <w:instrText xml:space="preserve"> PAGEREF _Toc243912839 \h </w:instrText>
             </w:r>
             <w:r>
               <w:rPr>
@@ -4018,7 +4735,220 @@
                 <w:noProof/>
                 <w:webHidden/>
               </w:rPr>
-              <w:t>30</w:t>
+              <w:t>37</w:t>
+            </w:r>
+            <w:r>
+              <w:rPr>
+                <w:noProof/>
+                <w:webHidden/>
+              </w:rPr>
+              <w:fldChar w:fldCharType="end"/>
+            </w:r>
+          </w:hyperlink>
+        </w:p>
+        <w:p>
+          <w:pPr>
+            <w:pStyle w:val="Sumrio4"/>
+            <w:tabs>
+              <w:tab w:val="right" w:leader="dot" w:pos="9829"/>
+            </w:tabs>
+            <w:rPr>
+              <w:rFonts w:asciiTheme="minorHAnsi" w:eastAsiaTheme="minorEastAsia" w:hAnsiTheme="minorHAnsi" w:cstheme="minorBidi"/>
+              <w:noProof/>
+              <w:kern w:val="2"/>
+              <w14:ligatures w14:val="standardContextual"/>
+            </w:rPr>
+          </w:pPr>
+          <w:hyperlink w:anchor="_Toc243912840" w:history="1">
+            <w:r>
+              <w:rPr>
+                <w:rStyle w:val="Hyperlink"/>
+                <w:noProof/>
+              </w:rPr>
+              <w:t>B.1 Decisões de projeto registradas</w:t>
+            </w:r>
+            <w:r>
+              <w:rPr>
+                <w:noProof/>
+                <w:webHidden/>
+              </w:rPr>
+              <w:tab/>
+            </w:r>
+            <w:r>
+              <w:rPr>
+                <w:noProof/>
+                <w:webHidden/>
+              </w:rPr>
+              <w:fldChar w:fldCharType="begin"/>
+            </w:r>
+            <w:r>
+              <w:rPr>
+                <w:noProof/>
+                <w:webHidden/>
+              </w:rPr>
+              <w:instrText xml:space="preserve"> PAGEREF _Toc243912840 \h </w:instrText>
+            </w:r>
+            <w:r>
+              <w:rPr>
+                <w:noProof/>
+                <w:webHidden/>
+              </w:rPr>
+            </w:r>
+            <w:r>
+              <w:rPr>
+                <w:noProof/>
+                <w:webHidden/>
+              </w:rPr>
+              <w:fldChar w:fldCharType="separate"/>
+            </w:r>
+            <w:r>
+              <w:rPr>
+                <w:noProof/>
+                <w:webHidden/>
+              </w:rPr>
+              <w:t>37</w:t>
+            </w:r>
+            <w:r>
+              <w:rPr>
+                <w:noProof/>
+                <w:webHidden/>
+              </w:rPr>
+              <w:fldChar w:fldCharType="end"/>
+            </w:r>
+          </w:hyperlink>
+        </w:p>
+        <w:p>
+          <w:pPr>
+            <w:pStyle w:val="Sumrio4"/>
+            <w:tabs>
+              <w:tab w:val="right" w:leader="dot" w:pos="9829"/>
+            </w:tabs>
+            <w:rPr>
+              <w:rFonts w:asciiTheme="minorHAnsi" w:eastAsiaTheme="minorEastAsia" w:hAnsiTheme="minorHAnsi" w:cstheme="minorBidi"/>
+              <w:noProof/>
+              <w:kern w:val="2"/>
+              <w14:ligatures w14:val="standardContextual"/>
+            </w:rPr>
+          </w:pPr>
+          <w:hyperlink w:anchor="_Toc243912841" w:history="1">
+            <w:r>
+              <w:rPr>
+                <w:rStyle w:val="Hyperlink"/>
+                <w:noProof/>
+              </w:rPr>
+              <w:t>B.2 Divergências entre o texto do ERS e os diagramas a corrigir</w:t>
+            </w:r>
+            <w:r>
+              <w:rPr>
+                <w:noProof/>
+                <w:webHidden/>
+              </w:rPr>
+              <w:tab/>
+            </w:r>
+            <w:r>
+              <w:rPr>
+                <w:noProof/>
+                <w:webHidden/>
+              </w:rPr>
+              <w:fldChar w:fldCharType="begin"/>
+            </w:r>
+            <w:r>
+              <w:rPr>
+                <w:noProof/>
+                <w:webHidden/>
+              </w:rPr>
+              <w:instrText xml:space="preserve"> PAGEREF _Toc243912841 \h </w:instrText>
+            </w:r>
+            <w:r>
+              <w:rPr>
+                <w:noProof/>
+                <w:webHidden/>
+              </w:rPr>
+            </w:r>
+            <w:r>
+              <w:rPr>
+                <w:noProof/>
+                <w:webHidden/>
+              </w:rPr>
+              <w:fldChar w:fldCharType="separate"/>
+            </w:r>
+            <w:r>
+              <w:rPr>
+                <w:noProof/>
+                <w:webHidden/>
+              </w:rPr>
+              <w:t>38</w:t>
+            </w:r>
+            <w:r>
+              <w:rPr>
+                <w:noProof/>
+                <w:webHidden/>
+              </w:rPr>
+              <w:fldChar w:fldCharType="end"/>
+            </w:r>
+          </w:hyperlink>
+        </w:p>
+        <w:p>
+          <w:pPr>
+            <w:pStyle w:val="Sumrio4"/>
+            <w:tabs>
+              <w:tab w:val="right" w:leader="dot" w:pos="9829"/>
+            </w:tabs>
+            <w:rPr>
+              <w:rFonts w:asciiTheme="minorHAnsi" w:eastAsiaTheme="minorEastAsia" w:hAnsiTheme="minorHAnsi" w:cstheme="minorBidi"/>
+              <w:noProof/>
+              <w:kern w:val="2"/>
+              <w14:ligatures w14:val="standardContextual"/>
+            </w:rPr>
+          </w:pPr>
+          <w:hyperlink w:anchor="_Toc243912842" w:history="1">
+            <w:r>
+              <w:rPr>
+                <w:rStyle w:val="Hyperlink"/>
+                <w:noProof/>
+              </w:rPr>
+              <w:t>B.4 Dificuldades e mudanças de escopo</w:t>
+            </w:r>
+            <w:r>
+              <w:rPr>
+                <w:noProof/>
+                <w:webHidden/>
+              </w:rPr>
+              <w:tab/>
+            </w:r>
+            <w:r>
+              <w:rPr>
+                <w:noProof/>
+                <w:webHidden/>
+              </w:rPr>
+              <w:fldChar w:fldCharType="begin"/>
+            </w:r>
+            <w:r>
+              <w:rPr>
+                <w:noProof/>
+                <w:webHidden/>
+              </w:rPr>
+              <w:instrText xml:space="preserve"> PAGEREF _Toc243912842 \h </w:instrText>
+            </w:r>
+            <w:r>
+              <w:rPr>
+                <w:noProof/>
+                <w:webHidden/>
+              </w:rPr>
+            </w:r>
+            <w:r>
+              <w:rPr>
+                <w:noProof/>
+                <w:webHidden/>
+              </w:rPr>
+              <w:fldChar w:fldCharType="separate"/>
+            </w:r>
+            <w:r>
+              <w:rPr>
+                <w:noProof/>
+                <w:webHidden/>
+              </w:rPr>
+              <w:t>40</w:t>
             </w:r>
             <w:r>
               <w:rPr>
@@ -4042,13 +4972,13 @@
               <w14:ligatures w14:val="standardContextual"/>
             </w:rPr>
           </w:pPr>
-          <w:hyperlink w:anchor="_Toc243721557" w:history="1">
+          <w:hyperlink w:anchor="_Toc243912843" w:history="1">
             <w:r>
               <w:rPr>
                 <w:rStyle w:val="Hyperlink"/>
                 <w:noProof/>
               </w:rPr>
-              <w:t>5.3 Diagrama de Sequência</w:t>
+              <w:t>Apêndice C – Evidências dos testes</w:t>
             </w:r>
             <w:r>
               <w:rPr>
@@ -4069,1001 +4999,7 @@
                 <w:noProof/>
                 <w:webHidden/>
               </w:rPr>
-              <w:instrText xml:space="preserve"> PAGEREF _Toc243721557 \h </w:instrText>
-            </w:r>
-            <w:r>
-              <w:rPr>
-                <w:noProof/>
-                <w:webHidden/>
-              </w:rPr>
-            </w:r>
-            <w:r>
-              <w:rPr>
-                <w:noProof/>
-                <w:webHidden/>
-              </w:rPr>
-              <w:fldChar w:fldCharType="separate"/>
-            </w:r>
-            <w:r>
-              <w:rPr>
-                <w:noProof/>
-                <w:webHidden/>
-              </w:rPr>
-              <w:t>31</w:t>
-            </w:r>
-            <w:r>
-              <w:rPr>
-                <w:noProof/>
-                <w:webHidden/>
-              </w:rPr>
-              <w:fldChar w:fldCharType="end"/>
-            </w:r>
-          </w:hyperlink>
-        </w:p>
-        <w:p>
-          <w:pPr>
-            <w:pStyle w:val="Sumrio4"/>
-            <w:tabs>
-              <w:tab w:val="right" w:leader="dot" w:pos="9829"/>
-            </w:tabs>
-            <w:rPr>
-              <w:rFonts w:asciiTheme="minorHAnsi" w:eastAsiaTheme="minorEastAsia" w:hAnsiTheme="minorHAnsi" w:cstheme="minorBidi"/>
-              <w:noProof/>
-              <w:kern w:val="2"/>
-              <w14:ligatures w14:val="standardContextual"/>
-            </w:rPr>
-          </w:pPr>
-          <w:hyperlink w:anchor="_Toc243721558" w:history="1">
-            <w:r>
-              <w:rPr>
-                <w:rStyle w:val="Hyperlink"/>
-                <w:noProof/>
-              </w:rPr>
-              <w:t>5.3.1 Diagrama de Sequência [RF 04] – Criar Vaga e Configurar Pipeline de Seleção.</w:t>
-            </w:r>
-            <w:r>
-              <w:rPr>
-                <w:noProof/>
-                <w:webHidden/>
-              </w:rPr>
-              <w:tab/>
-            </w:r>
-            <w:r>
-              <w:rPr>
-                <w:noProof/>
-                <w:webHidden/>
-              </w:rPr>
-              <w:fldChar w:fldCharType="begin"/>
-            </w:r>
-            <w:r>
-              <w:rPr>
-                <w:noProof/>
-                <w:webHidden/>
-              </w:rPr>
-              <w:instrText xml:space="preserve"> PAGEREF _Toc243721558 \h </w:instrText>
-            </w:r>
-            <w:r>
-              <w:rPr>
-                <w:noProof/>
-                <w:webHidden/>
-              </w:rPr>
-            </w:r>
-            <w:r>
-              <w:rPr>
-                <w:noProof/>
-                <w:webHidden/>
-              </w:rPr>
-              <w:fldChar w:fldCharType="separate"/>
-            </w:r>
-            <w:r>
-              <w:rPr>
-                <w:noProof/>
-                <w:webHidden/>
-              </w:rPr>
-              <w:t>31</w:t>
-            </w:r>
-            <w:r>
-              <w:rPr>
-                <w:noProof/>
-                <w:webHidden/>
-              </w:rPr>
-              <w:fldChar w:fldCharType="end"/>
-            </w:r>
-          </w:hyperlink>
-        </w:p>
-        <w:p>
-          <w:pPr>
-            <w:pStyle w:val="Sumrio4"/>
-            <w:tabs>
-              <w:tab w:val="right" w:leader="dot" w:pos="9829"/>
-            </w:tabs>
-            <w:rPr>
-              <w:rFonts w:asciiTheme="minorHAnsi" w:eastAsiaTheme="minorEastAsia" w:hAnsiTheme="minorHAnsi" w:cstheme="minorBidi"/>
-              <w:noProof/>
-              <w:kern w:val="2"/>
-              <w14:ligatures w14:val="standardContextual"/>
-            </w:rPr>
-          </w:pPr>
-          <w:hyperlink w:anchor="_Toc243721559" w:history="1">
-            <w:r>
-              <w:rPr>
-                <w:rStyle w:val="Hyperlink"/>
-                <w:noProof/>
-              </w:rPr>
-              <w:t>5.3.2 Diagrama de Sequência [RF 02, RF 03, RN001] – Completar Perfil, Candidatar-se e Triagem Automática</w:t>
-            </w:r>
-            <w:r>
-              <w:rPr>
-                <w:noProof/>
-                <w:webHidden/>
-              </w:rPr>
-              <w:tab/>
-            </w:r>
-            <w:r>
-              <w:rPr>
-                <w:noProof/>
-                <w:webHidden/>
-              </w:rPr>
-              <w:fldChar w:fldCharType="begin"/>
-            </w:r>
-            <w:r>
-              <w:rPr>
-                <w:noProof/>
-                <w:webHidden/>
-              </w:rPr>
-              <w:instrText xml:space="preserve"> PAGEREF _Toc243721559 \h </w:instrText>
-            </w:r>
-            <w:r>
-              <w:rPr>
-                <w:noProof/>
-                <w:webHidden/>
-              </w:rPr>
-            </w:r>
-            <w:r>
-              <w:rPr>
-                <w:noProof/>
-                <w:webHidden/>
-              </w:rPr>
-              <w:fldChar w:fldCharType="separate"/>
-            </w:r>
-            <w:r>
-              <w:rPr>
-                <w:noProof/>
-                <w:webHidden/>
-              </w:rPr>
-              <w:t>32</w:t>
-            </w:r>
-            <w:r>
-              <w:rPr>
-                <w:noProof/>
-                <w:webHidden/>
-              </w:rPr>
-              <w:fldChar w:fldCharType="end"/>
-            </w:r>
-          </w:hyperlink>
-        </w:p>
-        <w:p>
-          <w:pPr>
-            <w:pStyle w:val="Sumrio4"/>
-            <w:tabs>
-              <w:tab w:val="right" w:leader="dot" w:pos="9829"/>
-            </w:tabs>
-            <w:rPr>
-              <w:rFonts w:asciiTheme="minorHAnsi" w:eastAsiaTheme="minorEastAsia" w:hAnsiTheme="minorHAnsi" w:cstheme="minorBidi"/>
-              <w:noProof/>
-              <w:kern w:val="2"/>
-              <w14:ligatures w14:val="standardContextual"/>
-            </w:rPr>
-          </w:pPr>
-          <w:hyperlink w:anchor="_Toc243721560" w:history="1">
-            <w:r>
-              <w:rPr>
-                <w:rStyle w:val="Hyperlink"/>
-                <w:noProof/>
-              </w:rPr>
-              <w:t>5.3.3 Diagrama de Sequência [RF 05, RF 06] – Teste de Código e Correção Automática</w:t>
-            </w:r>
-            <w:r>
-              <w:rPr>
-                <w:noProof/>
-                <w:webHidden/>
-              </w:rPr>
-              <w:tab/>
-            </w:r>
-            <w:r>
-              <w:rPr>
-                <w:noProof/>
-                <w:webHidden/>
-              </w:rPr>
-              <w:fldChar w:fldCharType="begin"/>
-            </w:r>
-            <w:r>
-              <w:rPr>
-                <w:noProof/>
-                <w:webHidden/>
-              </w:rPr>
-              <w:instrText xml:space="preserve"> PAGEREF _Toc243721560 \h </w:instrText>
-            </w:r>
-            <w:r>
-              <w:rPr>
-                <w:noProof/>
-                <w:webHidden/>
-              </w:rPr>
-            </w:r>
-            <w:r>
-              <w:rPr>
-                <w:noProof/>
-                <w:webHidden/>
-              </w:rPr>
-              <w:fldChar w:fldCharType="separate"/>
-            </w:r>
-            <w:r>
-              <w:rPr>
-                <w:noProof/>
-                <w:webHidden/>
-              </w:rPr>
-              <w:t>33</w:t>
-            </w:r>
-            <w:r>
-              <w:rPr>
-                <w:noProof/>
-                <w:webHidden/>
-              </w:rPr>
-              <w:fldChar w:fldCharType="end"/>
-            </w:r>
-          </w:hyperlink>
-        </w:p>
-        <w:p>
-          <w:pPr>
-            <w:pStyle w:val="Sumrio3"/>
-            <w:tabs>
-              <w:tab w:val="right" w:leader="dot" w:pos="9829"/>
-            </w:tabs>
-            <w:rPr>
-              <w:rFonts w:asciiTheme="minorHAnsi" w:eastAsiaTheme="minorEastAsia" w:hAnsiTheme="minorHAnsi" w:cstheme="minorBidi"/>
-              <w:noProof/>
-              <w:kern w:val="2"/>
-              <w14:ligatures w14:val="standardContextual"/>
-            </w:rPr>
-          </w:pPr>
-          <w:hyperlink w:anchor="_Toc243721561" w:history="1">
-            <w:r>
-              <w:rPr>
-                <w:rStyle w:val="Hyperlink"/>
-                <w:noProof/>
-              </w:rPr>
-              <w:t>5.4 Diagrama de Entidade e Relacionamento (DER)</w:t>
-            </w:r>
-            <w:r>
-              <w:rPr>
-                <w:noProof/>
-                <w:webHidden/>
-              </w:rPr>
-              <w:tab/>
-            </w:r>
-            <w:r>
-              <w:rPr>
-                <w:noProof/>
-                <w:webHidden/>
-              </w:rPr>
-              <w:fldChar w:fldCharType="begin"/>
-            </w:r>
-            <w:r>
-              <w:rPr>
-                <w:noProof/>
-                <w:webHidden/>
-              </w:rPr>
-              <w:instrText xml:space="preserve"> PAGEREF _Toc243721561 \h </w:instrText>
-            </w:r>
-            <w:r>
-              <w:rPr>
-                <w:noProof/>
-                <w:webHidden/>
-              </w:rPr>
-            </w:r>
-            <w:r>
-              <w:rPr>
-                <w:noProof/>
-                <w:webHidden/>
-              </w:rPr>
-              <w:fldChar w:fldCharType="separate"/>
-            </w:r>
-            <w:r>
-              <w:rPr>
-                <w:noProof/>
-                <w:webHidden/>
-              </w:rPr>
-              <w:t>34</w:t>
-            </w:r>
-            <w:r>
-              <w:rPr>
-                <w:noProof/>
-                <w:webHidden/>
-              </w:rPr>
-              <w:fldChar w:fldCharType="end"/>
-            </w:r>
-          </w:hyperlink>
-        </w:p>
-        <w:p>
-          <w:pPr>
-            <w:pStyle w:val="Sumrio3"/>
-            <w:tabs>
-              <w:tab w:val="right" w:leader="dot" w:pos="9829"/>
-            </w:tabs>
-            <w:rPr>
-              <w:rFonts w:asciiTheme="minorHAnsi" w:eastAsiaTheme="minorEastAsia" w:hAnsiTheme="minorHAnsi" w:cstheme="minorBidi"/>
-              <w:noProof/>
-              <w:kern w:val="2"/>
-              <w14:ligatures w14:val="standardContextual"/>
-            </w:rPr>
-          </w:pPr>
-          <w:hyperlink w:anchor="_Toc243721562" w:history="1">
-            <w:r>
-              <w:rPr>
-                <w:rStyle w:val="Hyperlink"/>
-                <w:noProof/>
-              </w:rPr>
-              <w:t>5.5 Diagramas de Atividade</w:t>
-            </w:r>
-            <w:r>
-              <w:rPr>
-                <w:noProof/>
-                <w:webHidden/>
-              </w:rPr>
-              <w:tab/>
-            </w:r>
-            <w:r>
-              <w:rPr>
-                <w:noProof/>
-                <w:webHidden/>
-              </w:rPr>
-              <w:fldChar w:fldCharType="begin"/>
-            </w:r>
-            <w:r>
-              <w:rPr>
-                <w:noProof/>
-                <w:webHidden/>
-              </w:rPr>
-              <w:instrText xml:space="preserve"> PAGEREF _Toc243721562 \h </w:instrText>
-            </w:r>
-            <w:r>
-              <w:rPr>
-                <w:noProof/>
-                <w:webHidden/>
-              </w:rPr>
-            </w:r>
-            <w:r>
-              <w:rPr>
-                <w:noProof/>
-                <w:webHidden/>
-              </w:rPr>
-              <w:fldChar w:fldCharType="separate"/>
-            </w:r>
-            <w:r>
-              <w:rPr>
-                <w:noProof/>
-                <w:webHidden/>
-              </w:rPr>
-              <w:t>35</w:t>
-            </w:r>
-            <w:r>
-              <w:rPr>
-                <w:noProof/>
-                <w:webHidden/>
-              </w:rPr>
-              <w:fldChar w:fldCharType="end"/>
-            </w:r>
-          </w:hyperlink>
-        </w:p>
-        <w:p>
-          <w:pPr>
-            <w:pStyle w:val="Sumrio4"/>
-            <w:tabs>
-              <w:tab w:val="right" w:leader="dot" w:pos="9829"/>
-            </w:tabs>
-            <w:rPr>
-              <w:rFonts w:asciiTheme="minorHAnsi" w:eastAsiaTheme="minorEastAsia" w:hAnsiTheme="minorHAnsi" w:cstheme="minorBidi"/>
-              <w:noProof/>
-              <w:kern w:val="2"/>
-              <w14:ligatures w14:val="standardContextual"/>
-            </w:rPr>
-          </w:pPr>
-          <w:hyperlink w:anchor="_Toc243721563" w:history="1">
-            <w:r>
-              <w:rPr>
-                <w:rStyle w:val="Hyperlink"/>
-                <w:noProof/>
-              </w:rPr>
-              <w:t>5.5.1 Diagrama de Atividade [RF 03, RN001] – Candidatura a uma Vaga</w:t>
-            </w:r>
-            <w:r>
-              <w:rPr>
-                <w:noProof/>
-                <w:webHidden/>
-              </w:rPr>
-              <w:tab/>
-            </w:r>
-            <w:r>
-              <w:rPr>
-                <w:noProof/>
-                <w:webHidden/>
-              </w:rPr>
-              <w:fldChar w:fldCharType="begin"/>
-            </w:r>
-            <w:r>
-              <w:rPr>
-                <w:noProof/>
-                <w:webHidden/>
-              </w:rPr>
-              <w:instrText xml:space="preserve"> PAGEREF _Toc243721563 \h </w:instrText>
-            </w:r>
-            <w:r>
-              <w:rPr>
-                <w:noProof/>
-                <w:webHidden/>
-              </w:rPr>
-            </w:r>
-            <w:r>
-              <w:rPr>
-                <w:noProof/>
-                <w:webHidden/>
-              </w:rPr>
-              <w:fldChar w:fldCharType="separate"/>
-            </w:r>
-            <w:r>
-              <w:rPr>
-                <w:noProof/>
-                <w:webHidden/>
-              </w:rPr>
-              <w:t>35</w:t>
-            </w:r>
-            <w:r>
-              <w:rPr>
-                <w:noProof/>
-                <w:webHidden/>
-              </w:rPr>
-              <w:fldChar w:fldCharType="end"/>
-            </w:r>
-          </w:hyperlink>
-        </w:p>
-        <w:p>
-          <w:pPr>
-            <w:pStyle w:val="Sumrio4"/>
-            <w:tabs>
-              <w:tab w:val="right" w:leader="dot" w:pos="9829"/>
-            </w:tabs>
-            <w:rPr>
-              <w:rFonts w:asciiTheme="minorHAnsi" w:eastAsiaTheme="minorEastAsia" w:hAnsiTheme="minorHAnsi" w:cstheme="minorBidi"/>
-              <w:noProof/>
-              <w:kern w:val="2"/>
-              <w14:ligatures w14:val="standardContextual"/>
-            </w:rPr>
-          </w:pPr>
-          <w:hyperlink w:anchor="_Toc243721564" w:history="1">
-            <w:r>
-              <w:rPr>
-                <w:rStyle w:val="Hyperlink"/>
-                <w:noProof/>
-              </w:rPr>
-              <w:t>5.5.2 Diagrama de Atividade [RF 05, RF 06] – Teste de Código e Correção Automática</w:t>
-            </w:r>
-            <w:r>
-              <w:rPr>
-                <w:noProof/>
-                <w:webHidden/>
-              </w:rPr>
-              <w:tab/>
-            </w:r>
-            <w:r>
-              <w:rPr>
-                <w:noProof/>
-                <w:webHidden/>
-              </w:rPr>
-              <w:fldChar w:fldCharType="begin"/>
-            </w:r>
-            <w:r>
-              <w:rPr>
-                <w:noProof/>
-                <w:webHidden/>
-              </w:rPr>
-              <w:instrText xml:space="preserve"> PAGEREF _Toc243721564 \h </w:instrText>
-            </w:r>
-            <w:r>
-              <w:rPr>
-                <w:noProof/>
-                <w:webHidden/>
-              </w:rPr>
-            </w:r>
-            <w:r>
-              <w:rPr>
-                <w:noProof/>
-                <w:webHidden/>
-              </w:rPr>
-              <w:fldChar w:fldCharType="separate"/>
-            </w:r>
-            <w:r>
-              <w:rPr>
-                <w:noProof/>
-                <w:webHidden/>
-              </w:rPr>
-              <w:t>36</w:t>
-            </w:r>
-            <w:r>
-              <w:rPr>
-                <w:noProof/>
-                <w:webHidden/>
-              </w:rPr>
-              <w:fldChar w:fldCharType="end"/>
-            </w:r>
-          </w:hyperlink>
-        </w:p>
-        <w:p>
-          <w:pPr>
-            <w:pStyle w:val="Sumrio2"/>
-            <w:tabs>
-              <w:tab w:val="right" w:leader="dot" w:pos="9829"/>
-            </w:tabs>
-            <w:rPr>
-              <w:rFonts w:asciiTheme="minorHAnsi" w:eastAsiaTheme="minorEastAsia" w:hAnsiTheme="minorHAnsi" w:cstheme="minorBidi"/>
-              <w:noProof/>
-              <w:kern w:val="2"/>
-              <w14:ligatures w14:val="standardContextual"/>
-            </w:rPr>
-          </w:pPr>
-          <w:hyperlink w:anchor="_Toc243721565" w:history="1">
-            <w:r>
-              <w:rPr>
-                <w:rStyle w:val="Hyperlink"/>
-                <w:noProof/>
-              </w:rPr>
-              <w:t>6. Casos de Testes</w:t>
-            </w:r>
-            <w:r>
-              <w:rPr>
-                <w:noProof/>
-                <w:webHidden/>
-              </w:rPr>
-              <w:tab/>
-            </w:r>
-            <w:r>
-              <w:rPr>
-                <w:noProof/>
-                <w:webHidden/>
-              </w:rPr>
-              <w:fldChar w:fldCharType="begin"/>
-            </w:r>
-            <w:r>
-              <w:rPr>
-                <w:noProof/>
-                <w:webHidden/>
-              </w:rPr>
-              <w:instrText xml:space="preserve"> PAGEREF _Toc243721565 \h </w:instrText>
-            </w:r>
-            <w:r>
-              <w:rPr>
-                <w:noProof/>
-                <w:webHidden/>
-              </w:rPr>
-            </w:r>
-            <w:r>
-              <w:rPr>
-                <w:noProof/>
-                <w:webHidden/>
-              </w:rPr>
-              <w:fldChar w:fldCharType="separate"/>
-            </w:r>
-            <w:r>
-              <w:rPr>
-                <w:noProof/>
-                <w:webHidden/>
-              </w:rPr>
-              <w:t>36</w:t>
-            </w:r>
-            <w:r>
-              <w:rPr>
-                <w:noProof/>
-                <w:webHidden/>
-              </w:rPr>
-              <w:fldChar w:fldCharType="end"/>
-            </w:r>
-          </w:hyperlink>
-        </w:p>
-        <w:p>
-          <w:pPr>
-            <w:pStyle w:val="Sumrio3"/>
-            <w:tabs>
-              <w:tab w:val="right" w:leader="dot" w:pos="9829"/>
-            </w:tabs>
-            <w:rPr>
-              <w:rFonts w:asciiTheme="minorHAnsi" w:eastAsiaTheme="minorEastAsia" w:hAnsiTheme="minorHAnsi" w:cstheme="minorBidi"/>
-              <w:noProof/>
-              <w:kern w:val="2"/>
-              <w14:ligatures w14:val="standardContextual"/>
-            </w:rPr>
-          </w:pPr>
-          <w:hyperlink w:anchor="_Toc243721566" w:history="1">
-            <w:r>
-              <w:rPr>
-                <w:rStyle w:val="Hyperlink"/>
-                <w:noProof/>
-              </w:rPr>
-              <w:t>Apêndice A – Documento da SAGA SENAI</w:t>
-            </w:r>
-            <w:r>
-              <w:rPr>
-                <w:noProof/>
-                <w:webHidden/>
-              </w:rPr>
-              <w:tab/>
-            </w:r>
-            <w:r>
-              <w:rPr>
-                <w:noProof/>
-                <w:webHidden/>
-              </w:rPr>
-              <w:fldChar w:fldCharType="begin"/>
-            </w:r>
-            <w:r>
-              <w:rPr>
-                <w:noProof/>
-                <w:webHidden/>
-              </w:rPr>
-              <w:instrText xml:space="preserve"> PAGEREF _Toc243721566 \h </w:instrText>
-            </w:r>
-            <w:r>
-              <w:rPr>
-                <w:noProof/>
-                <w:webHidden/>
-              </w:rPr>
-            </w:r>
-            <w:r>
-              <w:rPr>
-                <w:noProof/>
-                <w:webHidden/>
-              </w:rPr>
-              <w:fldChar w:fldCharType="separate"/>
-            </w:r>
-            <w:r>
-              <w:rPr>
-                <w:noProof/>
-                <w:webHidden/>
-              </w:rPr>
-              <w:t>36</w:t>
-            </w:r>
-            <w:r>
-              <w:rPr>
-                <w:noProof/>
-                <w:webHidden/>
-              </w:rPr>
-              <w:fldChar w:fldCharType="end"/>
-            </w:r>
-          </w:hyperlink>
-        </w:p>
-        <w:p>
-          <w:pPr>
-            <w:pStyle w:val="Sumrio3"/>
-            <w:tabs>
-              <w:tab w:val="right" w:leader="dot" w:pos="9829"/>
-            </w:tabs>
-            <w:rPr>
-              <w:rFonts w:asciiTheme="minorHAnsi" w:eastAsiaTheme="minorEastAsia" w:hAnsiTheme="minorHAnsi" w:cstheme="minorBidi"/>
-              <w:noProof/>
-              <w:kern w:val="2"/>
-              <w14:ligatures w14:val="standardContextual"/>
-            </w:rPr>
-          </w:pPr>
-          <w:hyperlink w:anchor="_Toc243721567" w:history="1">
-            <w:r>
-              <w:rPr>
-                <w:rStyle w:val="Hyperlink"/>
-                <w:noProof/>
-              </w:rPr>
-              <w:t>Apêndice B – Registro de decisões, divergências, dificuldades e mudanças de escopo (Sprint 2)</w:t>
-            </w:r>
-            <w:r>
-              <w:rPr>
-                <w:noProof/>
-                <w:webHidden/>
-              </w:rPr>
-              <w:tab/>
-            </w:r>
-            <w:r>
-              <w:rPr>
-                <w:noProof/>
-                <w:webHidden/>
-              </w:rPr>
-              <w:fldChar w:fldCharType="begin"/>
-            </w:r>
-            <w:r>
-              <w:rPr>
-                <w:noProof/>
-                <w:webHidden/>
-              </w:rPr>
-              <w:instrText xml:space="preserve"> PAGEREF _Toc243721567 \h </w:instrText>
-            </w:r>
-            <w:r>
-              <w:rPr>
-                <w:noProof/>
-                <w:webHidden/>
-              </w:rPr>
-            </w:r>
-            <w:r>
-              <w:rPr>
-                <w:noProof/>
-                <w:webHidden/>
-              </w:rPr>
-              <w:fldChar w:fldCharType="separate"/>
-            </w:r>
-            <w:r>
-              <w:rPr>
-                <w:noProof/>
-                <w:webHidden/>
-              </w:rPr>
-              <w:t>37</w:t>
-            </w:r>
-            <w:r>
-              <w:rPr>
-                <w:noProof/>
-                <w:webHidden/>
-              </w:rPr>
-              <w:fldChar w:fldCharType="end"/>
-            </w:r>
-          </w:hyperlink>
-        </w:p>
-        <w:p>
-          <w:pPr>
-            <w:pStyle w:val="Sumrio4"/>
-            <w:tabs>
-              <w:tab w:val="right" w:leader="dot" w:pos="9829"/>
-            </w:tabs>
-            <w:rPr>
-              <w:rFonts w:asciiTheme="minorHAnsi" w:eastAsiaTheme="minorEastAsia" w:hAnsiTheme="minorHAnsi" w:cstheme="minorBidi"/>
-              <w:noProof/>
-              <w:kern w:val="2"/>
-              <w14:ligatures w14:val="standardContextual"/>
-            </w:rPr>
-          </w:pPr>
-          <w:hyperlink w:anchor="_Toc243721568" w:history="1">
-            <w:r>
-              <w:rPr>
-                <w:rStyle w:val="Hyperlink"/>
-                <w:noProof/>
-              </w:rPr>
-              <w:t>B.1 Decisões de projeto registradas</w:t>
-            </w:r>
-            <w:r>
-              <w:rPr>
-                <w:noProof/>
-                <w:webHidden/>
-              </w:rPr>
-              <w:tab/>
-            </w:r>
-            <w:r>
-              <w:rPr>
-                <w:noProof/>
-                <w:webHidden/>
-              </w:rPr>
-              <w:fldChar w:fldCharType="begin"/>
-            </w:r>
-            <w:r>
-              <w:rPr>
-                <w:noProof/>
-                <w:webHidden/>
-              </w:rPr>
-              <w:instrText xml:space="preserve"> PAGEREF _Toc243721568 \h </w:instrText>
-            </w:r>
-            <w:r>
-              <w:rPr>
-                <w:noProof/>
-                <w:webHidden/>
-              </w:rPr>
-            </w:r>
-            <w:r>
-              <w:rPr>
-                <w:noProof/>
-                <w:webHidden/>
-              </w:rPr>
-              <w:fldChar w:fldCharType="separate"/>
-            </w:r>
-            <w:r>
-              <w:rPr>
-                <w:noProof/>
-                <w:webHidden/>
-              </w:rPr>
-              <w:t>37</w:t>
-            </w:r>
-            <w:r>
-              <w:rPr>
-                <w:noProof/>
-                <w:webHidden/>
-              </w:rPr>
-              <w:fldChar w:fldCharType="end"/>
-            </w:r>
-          </w:hyperlink>
-        </w:p>
-        <w:p>
-          <w:pPr>
-            <w:pStyle w:val="Sumrio4"/>
-            <w:tabs>
-              <w:tab w:val="right" w:leader="dot" w:pos="9829"/>
-            </w:tabs>
-            <w:rPr>
-              <w:rFonts w:asciiTheme="minorHAnsi" w:eastAsiaTheme="minorEastAsia" w:hAnsiTheme="minorHAnsi" w:cstheme="minorBidi"/>
-              <w:noProof/>
-              <w:kern w:val="2"/>
-              <w14:ligatures w14:val="standardContextual"/>
-            </w:rPr>
-          </w:pPr>
-          <w:hyperlink w:anchor="_Toc243721569" w:history="1">
-            <w:r>
-              <w:rPr>
-                <w:rStyle w:val="Hyperlink"/>
-                <w:noProof/>
-              </w:rPr>
-              <w:t>B.2 Divergências entre o texto do ERS e os diagramas a corrigir</w:t>
-            </w:r>
-            <w:r>
-              <w:rPr>
-                <w:noProof/>
-                <w:webHidden/>
-              </w:rPr>
-              <w:tab/>
-            </w:r>
-            <w:r>
-              <w:rPr>
-                <w:noProof/>
-                <w:webHidden/>
-              </w:rPr>
-              <w:fldChar w:fldCharType="begin"/>
-            </w:r>
-            <w:r>
-              <w:rPr>
-                <w:noProof/>
-                <w:webHidden/>
-              </w:rPr>
-              <w:instrText xml:space="preserve"> PAGEREF _Toc243721569 \h </w:instrText>
-            </w:r>
-            <w:r>
-              <w:rPr>
-                <w:noProof/>
-                <w:webHidden/>
-              </w:rPr>
-            </w:r>
-            <w:r>
-              <w:rPr>
-                <w:noProof/>
-                <w:webHidden/>
-              </w:rPr>
-              <w:fldChar w:fldCharType="separate"/>
-            </w:r>
-            <w:r>
-              <w:rPr>
-                <w:noProof/>
-                <w:webHidden/>
-              </w:rPr>
-              <w:t>38</w:t>
-            </w:r>
-            <w:r>
-              <w:rPr>
-                <w:noProof/>
-                <w:webHidden/>
-              </w:rPr>
-              <w:fldChar w:fldCharType="end"/>
-            </w:r>
-          </w:hyperlink>
-        </w:p>
-        <w:p>
-          <w:pPr>
-            <w:pStyle w:val="Sumrio4"/>
-            <w:tabs>
-              <w:tab w:val="right" w:leader="dot" w:pos="9829"/>
-            </w:tabs>
-            <w:rPr>
-              <w:rFonts w:asciiTheme="minorHAnsi" w:eastAsiaTheme="minorEastAsia" w:hAnsiTheme="minorHAnsi" w:cstheme="minorBidi"/>
-              <w:noProof/>
-              <w:kern w:val="2"/>
-              <w14:ligatures w14:val="standardContextual"/>
-            </w:rPr>
-          </w:pPr>
-          <w:hyperlink w:anchor="_Toc243721570" w:history="1">
-            <w:r>
-              <w:rPr>
-                <w:rStyle w:val="Hyperlink"/>
-                <w:noProof/>
-              </w:rPr>
-              <w:t>B.4 Dificuldades e mudanças de escopo</w:t>
-            </w:r>
-            <w:r>
-              <w:rPr>
-                <w:noProof/>
-                <w:webHidden/>
-              </w:rPr>
-              <w:tab/>
-            </w:r>
-            <w:r>
-              <w:rPr>
-                <w:noProof/>
-                <w:webHidden/>
-              </w:rPr>
-              <w:fldChar w:fldCharType="begin"/>
-            </w:r>
-            <w:r>
-              <w:rPr>
-                <w:noProof/>
-                <w:webHidden/>
-              </w:rPr>
-              <w:instrText xml:space="preserve"> PAGEREF _Toc243721570 \h </w:instrText>
-            </w:r>
-            <w:r>
-              <w:rPr>
-                <w:noProof/>
-                <w:webHidden/>
-              </w:rPr>
-            </w:r>
-            <w:r>
-              <w:rPr>
-                <w:noProof/>
-                <w:webHidden/>
-              </w:rPr>
-              <w:fldChar w:fldCharType="separate"/>
-            </w:r>
-            <w:r>
-              <w:rPr>
-                <w:noProof/>
-                <w:webHidden/>
-              </w:rPr>
-              <w:t>40</w:t>
-            </w:r>
-            <w:r>
-              <w:rPr>
-                <w:noProof/>
-                <w:webHidden/>
-              </w:rPr>
-              <w:fldChar w:fldCharType="end"/>
-            </w:r>
-          </w:hyperlink>
-        </w:p>
-        <w:p>
-          <w:pPr>
-            <w:pStyle w:val="Sumrio3"/>
-            <w:tabs>
-              <w:tab w:val="right" w:leader="dot" w:pos="9829"/>
-            </w:tabs>
-            <w:rPr>
-              <w:rFonts w:asciiTheme="minorHAnsi" w:eastAsiaTheme="minorEastAsia" w:hAnsiTheme="minorHAnsi" w:cstheme="minorBidi"/>
-              <w:noProof/>
-              <w:kern w:val="2"/>
-              <w14:ligatures w14:val="standardContextual"/>
-            </w:rPr>
-          </w:pPr>
-          <w:hyperlink w:anchor="_Toc243721571" w:history="1">
-            <w:r>
-              <w:rPr>
-                <w:rStyle w:val="Hyperlink"/>
-                <w:noProof/>
-              </w:rPr>
-              <w:t>Apêndice C – Evidências dos testes</w:t>
-            </w:r>
-            <w:r>
-              <w:rPr>
-                <w:noProof/>
-                <w:webHidden/>
-              </w:rPr>
-              <w:tab/>
-            </w:r>
-            <w:r>
-              <w:rPr>
-                <w:noProof/>
-                <w:webHidden/>
-              </w:rPr>
-              <w:fldChar w:fldCharType="begin"/>
-            </w:r>
-            <w:r>
-              <w:rPr>
-                <w:noProof/>
-                <w:webHidden/>
-              </w:rPr>
-              <w:instrText xml:space="preserve"> PAGEREF _Toc243721571 \h </w:instrText>
+              <w:instrText xml:space="preserve"> PAGEREF _Toc243912843 \h </w:instrText>
             </w:r>
             <w:r>
               <w:rPr>
@@ -5146,7 +5082,7 @@
         <w:spacing w:line="360" w:lineRule="auto"/>
         <w:jc w:val="left"/>
       </w:pPr>
-      <w:bookmarkStart w:id="1" w:name="_Toc243721535"/>
+      <w:bookmarkStart w:id="1" w:name="_Toc243912808"/>
       <w:r>
         <w:lastRenderedPageBreak/>
         <w:t>Introdução</w:t>
@@ -5184,7 +5120,7 @@
         </w:numPr>
         <w:spacing w:line="360" w:lineRule="auto"/>
       </w:pPr>
-      <w:bookmarkStart w:id="2" w:name="_Toc243721536"/>
+      <w:bookmarkStart w:id="2" w:name="_Toc243912809"/>
       <w:r>
         <w:t>Objetivos deste documento</w:t>
       </w:r>
@@ -5233,7 +5169,7 @@
         </w:numPr>
         <w:spacing w:line="360" w:lineRule="auto"/>
       </w:pPr>
-      <w:bookmarkStart w:id="3" w:name="_Toc243721537"/>
+      <w:bookmarkStart w:id="3" w:name="_Toc243912810"/>
       <w:r>
         <w:t>Escopo do produto</w:t>
       </w:r>
@@ -5289,7 +5225,7 @@
           <w:szCs w:val="20"/>
         </w:rPr>
       </w:pPr>
-      <w:bookmarkStart w:id="4" w:name="_Toc243721538"/>
+      <w:bookmarkStart w:id="4" w:name="_Toc243912811"/>
       <w:r>
         <w:t>Nome do produto e de seus componentes principais</w:t>
       </w:r>
@@ -5394,7 +5330,7 @@
           <w:szCs w:val="20"/>
         </w:rPr>
       </w:pPr>
-      <w:bookmarkStart w:id="5" w:name="_Toc243721539"/>
+      <w:bookmarkStart w:id="5" w:name="_Toc243912812"/>
       <w:r>
         <w:t>Descrição do produto</w:t>
       </w:r>
@@ -5457,7 +5393,7 @@
           <w:szCs w:val="20"/>
         </w:rPr>
       </w:pPr>
-      <w:bookmarkStart w:id="6" w:name="_Toc243721540"/>
+      <w:bookmarkStart w:id="6" w:name="_Toc243912813"/>
       <w:r>
         <w:t>1.2.3 Missão do produto</w:t>
       </w:r>
@@ -5516,7 +5452,7 @@
           <w:szCs w:val="20"/>
         </w:rPr>
       </w:pPr>
-      <w:bookmarkStart w:id="7" w:name="_Toc243721541"/>
+      <w:bookmarkStart w:id="7" w:name="_Toc243912814"/>
       <w:r>
         <w:t>1.2.4 Tabela de viabilidade</w:t>
       </w:r>
@@ -6412,7 +6348,7 @@
           <w:szCs w:val="20"/>
         </w:rPr>
       </w:pPr>
-      <w:bookmarkStart w:id="8" w:name="_Toc243721542"/>
+      <w:bookmarkStart w:id="8" w:name="_Toc243912815"/>
       <w:r>
         <w:t>1.2.5 Justificativa</w:t>
       </w:r>
@@ -6511,7 +6447,7 @@
         </w:numPr>
         <w:spacing w:line="360" w:lineRule="auto"/>
       </w:pPr>
-      <w:bookmarkStart w:id="9" w:name="_Toc243721543"/>
+      <w:bookmarkStart w:id="9" w:name="_Toc243912816"/>
       <w:r>
         <w:t>Definições e siglas</w:t>
       </w:r>
@@ -8484,7 +8420,7 @@
         </w:numPr>
         <w:spacing w:line="360" w:lineRule="auto"/>
       </w:pPr>
-      <w:bookmarkStart w:id="10" w:name="_Toc243721544"/>
+      <w:bookmarkStart w:id="10" w:name="_Toc243912817"/>
       <w:r>
         <w:t>Técnica(s) utilizada(s) para levantamento de requisitos</w:t>
       </w:r>
@@ -8598,7 +8534,7 @@
         <w:pStyle w:val="Ttulo2"/>
         <w:jc w:val="left"/>
       </w:pPr>
-      <w:bookmarkStart w:id="12" w:name="_Toc243721545"/>
+      <w:bookmarkStart w:id="12" w:name="_Toc243912818"/>
       <w:r>
         <w:t>2. Requisitos Específicos</w:t>
       </w:r>
@@ -8627,7 +8563,7 @@
         <w:pStyle w:val="Ttulo3"/>
         <w:spacing w:line="360" w:lineRule="auto"/>
       </w:pPr>
-      <w:bookmarkStart w:id="13" w:name="_Toc243721546"/>
+      <w:bookmarkStart w:id="13" w:name="_Toc243912819"/>
       <w:r>
         <w:t>2.1 Requisitos Funcionais (RF)</w:t>
       </w:r>
@@ -10832,7 +10768,7 @@
         <w:pStyle w:val="Ttulo3"/>
         <w:spacing w:line="360" w:lineRule="auto"/>
       </w:pPr>
-      <w:bookmarkStart w:id="14" w:name="_Toc243721547"/>
+      <w:bookmarkStart w:id="14" w:name="_Toc243912820"/>
       <w:r>
         <w:t>2.2 Requisitos Não Funcionais (RNF)</w:t>
       </w:r>
@@ -12570,7 +12506,7 @@
         <w:pStyle w:val="Ttulo3"/>
         <w:spacing w:line="360" w:lineRule="auto"/>
       </w:pPr>
-      <w:bookmarkStart w:id="15" w:name="_Toc243721548"/>
+      <w:bookmarkStart w:id="15" w:name="_Toc243912821"/>
       <w:r>
         <w:lastRenderedPageBreak/>
         <w:t>2.3 Regras de Negócio (RN)</w:t>
@@ -12770,7 +12706,7 @@
       <w:pPr>
         <w:pStyle w:val="Ttulo3"/>
       </w:pPr>
-      <w:bookmarkStart w:id="16" w:name="_Toc243721549"/>
+      <w:bookmarkStart w:id="16" w:name="_Toc243912822"/>
       <w:r>
         <w:t>2.4 Priorização dos Requisitos (MVP / Desejável / Fora de Escopo)</w:t>
       </w:r>
@@ -14700,7 +14636,7 @@
         <w:spacing w:line="276" w:lineRule="auto"/>
         <w:jc w:val="left"/>
       </w:pPr>
-      <w:bookmarkStart w:id="17" w:name="_Toc243721550"/>
+      <w:bookmarkStart w:id="17" w:name="_Toc243912823"/>
       <w:r>
         <w:t>3. Cronograma do Projeto</w:t>
       </w:r>
@@ -14763,7 +14699,7 @@
         </w:pBdr>
         <w:spacing w:line="276" w:lineRule="auto"/>
       </w:pPr>
-      <w:bookmarkStart w:id="18" w:name="_Toc243721551"/>
+      <w:bookmarkStart w:id="18" w:name="_Toc243912824"/>
       <w:r>
         <w:t>3.1 Planejamento de Sprints</w:t>
       </w:r>
@@ -17807,7 +17743,7 @@
         <w:spacing w:line="360" w:lineRule="auto"/>
         <w:jc w:val="left"/>
       </w:pPr>
-      <w:bookmarkStart w:id="19" w:name="_Toc243721552"/>
+      <w:bookmarkStart w:id="19" w:name="_Toc243912825"/>
       <w:r>
         <w:t>4. Protótipo do produto</w:t>
       </w:r>
@@ -18341,12 +18277,9 @@
     </w:p>
     <w:p>
       <w:pPr>
-        <w:pStyle w:val="Ttulo2"/>
         <w:spacing w:line="360" w:lineRule="auto"/>
-        <w:jc w:val="left"/>
       </w:pPr>
       <w:bookmarkStart w:id="20" w:name="_7z3iqu93lx67" w:colFirst="0" w:colLast="0"/>
-      <w:bookmarkStart w:id="21" w:name="_Toc243721553"/>
       <w:bookmarkEnd w:id="20"/>
       <w:r>
         <w:rPr>
@@ -18397,7 +18330,6 @@
           </wp:anchor>
         </w:drawing>
       </w:r>
-      <w:bookmarkEnd w:id="21"/>
     </w:p>
     <w:p/>
     <w:p/>
@@ -18643,8 +18575,8 @@
         <w:spacing w:line="360" w:lineRule="auto"/>
         <w:jc w:val="left"/>
       </w:pPr>
-      <w:bookmarkStart w:id="22" w:name="_pxy1jr1yro5b" w:colFirst="0" w:colLast="0"/>
-      <w:bookmarkEnd w:id="22"/>
+      <w:bookmarkStart w:id="21" w:name="_pxy1jr1yro5b" w:colFirst="0" w:colLast="0"/>
+      <w:bookmarkEnd w:id="21"/>
     </w:p>
     <w:p>
       <w:pPr>
@@ -18652,22 +18584,22 @@
         <w:spacing w:line="360" w:lineRule="auto"/>
         <w:jc w:val="left"/>
       </w:pPr>
-      <w:bookmarkStart w:id="23" w:name="_Toc243721554"/>
+      <w:bookmarkStart w:id="22" w:name="_Toc243912826"/>
       <w:r>
         <w:t>5. Diagramas UML</w:t>
       </w:r>
-      <w:bookmarkEnd w:id="23"/>
+      <w:bookmarkEnd w:id="22"/>
     </w:p>
     <w:p>
       <w:pPr>
         <w:pStyle w:val="Ttulo3"/>
         <w:spacing w:line="360" w:lineRule="auto"/>
       </w:pPr>
-      <w:bookmarkStart w:id="24" w:name="_Toc243721555"/>
+      <w:bookmarkStart w:id="23" w:name="_Toc243912827"/>
       <w:r>
         <w:t>5.1 Diagrama de Casos de Uso</w:t>
       </w:r>
-      <w:bookmarkEnd w:id="24"/>
+      <w:bookmarkEnd w:id="23"/>
     </w:p>
     <w:p>
       <w:pPr>
@@ -19048,12 +18980,12 @@
         <w:pStyle w:val="Ttulo3"/>
         <w:spacing w:line="360" w:lineRule="auto"/>
       </w:pPr>
-      <w:bookmarkStart w:id="25" w:name="_Toc243721556"/>
+      <w:bookmarkStart w:id="24" w:name="_Toc243912828"/>
       <w:r>
         <w:lastRenderedPageBreak/>
         <w:t>5.2 Diagrama de Classes</w:t>
       </w:r>
-      <w:bookmarkEnd w:id="25"/>
+      <w:bookmarkEnd w:id="24"/>
     </w:p>
     <w:p>
       <w:pPr>
@@ -19319,21 +19251,21 @@
         <w:pStyle w:val="Ttulo3"/>
         <w:spacing w:line="360" w:lineRule="auto"/>
       </w:pPr>
-      <w:bookmarkStart w:id="26" w:name="_Toc243721557"/>
+      <w:bookmarkStart w:id="25" w:name="_Toc243912829"/>
       <w:r>
         <w:t>5.3 Diagrama de Sequência</w:t>
       </w:r>
+      <w:bookmarkEnd w:id="25"/>
+    </w:p>
+    <w:p>
+      <w:pPr>
+        <w:pStyle w:val="Ttulo4"/>
+      </w:pPr>
+      <w:bookmarkStart w:id="26" w:name="_Toc243912830"/>
+      <w:r>
+        <w:t>5.3.1 Diagrama de Sequência [RF 04] – Criar Vaga e Configurar Pipeline de Seleção.</w:t>
+      </w:r>
       <w:bookmarkEnd w:id="26"/>
-    </w:p>
-    <w:p>
-      <w:pPr>
-        <w:pStyle w:val="Ttulo4"/>
-      </w:pPr>
-      <w:bookmarkStart w:id="27" w:name="_Toc243721558"/>
-      <w:r>
-        <w:t>5.3.1 Diagrama de Sequência [RF 04] – Criar Vaga e Configurar Pipeline de Seleção.</w:t>
-      </w:r>
-      <w:bookmarkEnd w:id="27"/>
     </w:p>
     <w:p>
       <w:pPr>
@@ -19387,12 +19319,12 @@
       <w:pPr>
         <w:pStyle w:val="Ttulo4"/>
       </w:pPr>
-      <w:bookmarkStart w:id="28" w:name="_Toc243721559"/>
+      <w:bookmarkStart w:id="27" w:name="_Toc243912831"/>
       <w:r>
         <w:lastRenderedPageBreak/>
         <w:t>5.3.2 Diagrama de Sequência [RF 02, RF 03, RN001] – Completar Perfil, Candidatar-se e Triagem Automática</w:t>
       </w:r>
-      <w:bookmarkEnd w:id="28"/>
+      <w:bookmarkEnd w:id="27"/>
     </w:p>
     <w:p>
       <w:pPr>
@@ -19450,12 +19382,12 @@
       <w:pPr>
         <w:pStyle w:val="Ttulo4"/>
       </w:pPr>
-      <w:bookmarkStart w:id="29" w:name="_Toc243721560"/>
+      <w:bookmarkStart w:id="28" w:name="_Toc243912832"/>
       <w:r>
         <w:lastRenderedPageBreak/>
         <w:t>5.3.3 Diagrama de Sequência [RF 05, RF 06] – Teste de Código e Correção Automática</w:t>
       </w:r>
-      <w:bookmarkEnd w:id="29"/>
+      <w:bookmarkEnd w:id="28"/>
     </w:p>
     <w:p>
       <w:pPr>
@@ -19562,11 +19494,11 @@
         <w:pStyle w:val="Ttulo3"/>
         <w:spacing w:line="360" w:lineRule="auto"/>
       </w:pPr>
-      <w:bookmarkStart w:id="30" w:name="_Toc243721561"/>
+      <w:bookmarkStart w:id="29" w:name="_Toc243912833"/>
       <w:r>
         <w:t>5.4 Diagrama de Entidade e Relacionamento (DER)</w:t>
       </w:r>
-      <w:bookmarkEnd w:id="30"/>
+      <w:bookmarkEnd w:id="29"/>
     </w:p>
     <w:p>
       <w:pPr>
@@ -19774,12 +19706,12 @@
         <w:pStyle w:val="Ttulo3"/>
         <w:spacing w:line="360" w:lineRule="auto"/>
       </w:pPr>
-      <w:bookmarkStart w:id="31" w:name="_Toc243721562"/>
+      <w:bookmarkStart w:id="30" w:name="_Toc243912834"/>
       <w:r>
         <w:lastRenderedPageBreak/>
         <w:t>5.5 Diagramas de Atividade</w:t>
       </w:r>
-      <w:bookmarkEnd w:id="31"/>
+      <w:bookmarkEnd w:id="30"/>
     </w:p>
     <w:p>
       <w:pPr>
@@ -19811,11 +19743,11 @@
       <w:pPr>
         <w:pStyle w:val="Ttulo4"/>
       </w:pPr>
-      <w:bookmarkStart w:id="32" w:name="_Toc243721563"/>
+      <w:bookmarkStart w:id="31" w:name="_Toc243912835"/>
       <w:r>
         <w:t>5.5.1 Diagrama de Atividade [RF 03, RN001] – Candidatura a uma Vaga</w:t>
       </w:r>
-      <w:bookmarkEnd w:id="32"/>
+      <w:bookmarkEnd w:id="31"/>
     </w:p>
     <w:p>
       <w:pPr>
@@ -19868,12 +19800,12 @@
       <w:pPr>
         <w:pStyle w:val="Ttulo4"/>
       </w:pPr>
-      <w:bookmarkStart w:id="33" w:name="_Toc243721564"/>
+      <w:bookmarkStart w:id="32" w:name="_Toc243912836"/>
       <w:r>
         <w:lastRenderedPageBreak/>
         <w:t>5.5.2 Diagrama de Atividade [RF 05, RF 06] – Teste de Código e Correção Automática</w:t>
       </w:r>
-      <w:bookmarkEnd w:id="33"/>
+      <w:bookmarkEnd w:id="32"/>
     </w:p>
     <w:p>
       <w:pPr>
@@ -19929,8 +19861,8 @@
         <w:spacing w:line="360" w:lineRule="auto"/>
         <w:jc w:val="left"/>
       </w:pPr>
-      <w:bookmarkStart w:id="34" w:name="_qf64tbjx3ypu" w:colFirst="0" w:colLast="0"/>
-      <w:bookmarkEnd w:id="34"/>
+      <w:bookmarkStart w:id="33" w:name="_qf64tbjx3ypu" w:colFirst="0" w:colLast="0"/>
+      <w:bookmarkEnd w:id="33"/>
     </w:p>
     <w:p>
       <w:pPr>
@@ -19938,11 +19870,11 @@
         <w:spacing w:line="360" w:lineRule="auto"/>
         <w:jc w:val="left"/>
       </w:pPr>
-      <w:bookmarkStart w:id="35" w:name="_Toc243721565"/>
+      <w:bookmarkStart w:id="34" w:name="_Toc243912837"/>
       <w:r>
         <w:t>6. Casos de Testes</w:t>
       </w:r>
-      <w:bookmarkEnd w:id="35"/>
+      <w:bookmarkEnd w:id="34"/>
     </w:p>
     <w:p>
       <w:pPr>
@@ -20066,9 +19998,9 @@
           <w:szCs w:val="26"/>
         </w:rPr>
       </w:pPr>
-      <w:bookmarkStart w:id="36" w:name="_fzh5isku94b8" w:colFirst="0" w:colLast="0"/>
-      <w:bookmarkStart w:id="37" w:name="_Toc243721566"/>
-      <w:bookmarkEnd w:id="36"/>
+      <w:bookmarkStart w:id="35" w:name="_fzh5isku94b8" w:colFirst="0" w:colLast="0"/>
+      <w:bookmarkStart w:id="36" w:name="_Toc243912838"/>
+      <w:bookmarkEnd w:id="35"/>
       <w:r>
         <w:rPr>
           <w:sz w:val="26"/>
@@ -20076,7 +20008,7 @@
         </w:rPr>
         <w:t>Apêndice A – Documento da SAGA SENAI</w:t>
       </w:r>
-      <w:bookmarkEnd w:id="37"/>
+      <w:bookmarkEnd w:id="36"/>
     </w:p>
     <w:p>
       <w:pPr>
@@ -20108,9 +20040,9 @@
           <w:szCs w:val="26"/>
         </w:rPr>
       </w:pPr>
-      <w:bookmarkStart w:id="38" w:name="_4nkh18wzstsi" w:colFirst="0" w:colLast="0"/>
-      <w:bookmarkStart w:id="39" w:name="_Toc243721567"/>
-      <w:bookmarkEnd w:id="38"/>
+      <w:bookmarkStart w:id="37" w:name="_4nkh18wzstsi" w:colFirst="0" w:colLast="0"/>
+      <w:bookmarkStart w:id="38" w:name="_Toc243912839"/>
+      <w:bookmarkEnd w:id="37"/>
       <w:r>
         <w:rPr>
           <w:sz w:val="26"/>
@@ -20118,7 +20050,7 @@
         </w:rPr>
         <w:t>Apêndice B – Registro de decisões, divergências, dificuldades e mudanças de escopo (Sprint 2)</w:t>
       </w:r>
-      <w:bookmarkEnd w:id="39"/>
+      <w:bookmarkEnd w:id="38"/>
     </w:p>
     <w:p>
       <w:pPr>
@@ -20130,9 +20062,9 @@
           <w:szCs w:val="22"/>
         </w:rPr>
       </w:pPr>
-      <w:bookmarkStart w:id="40" w:name="_dhi9162zc8d9" w:colFirst="0" w:colLast="0"/>
-      <w:bookmarkStart w:id="41" w:name="_Toc243721568"/>
-      <w:bookmarkEnd w:id="40"/>
+      <w:bookmarkStart w:id="39" w:name="_dhi9162zc8d9" w:colFirst="0" w:colLast="0"/>
+      <w:bookmarkStart w:id="40" w:name="_Toc243912840"/>
+      <w:bookmarkEnd w:id="39"/>
       <w:r>
         <w:rPr>
           <w:sz w:val="22"/>
@@ -20140,7 +20072,7 @@
         </w:rPr>
         <w:t>B.1 Decisões de projeto registradas</w:t>
       </w:r>
-      <w:bookmarkEnd w:id="41"/>
+      <w:bookmarkEnd w:id="40"/>
     </w:p>
     <w:tbl>
       <w:tblPr>
@@ -21310,8 +21242,8 @@
           <w:szCs w:val="22"/>
         </w:rPr>
       </w:pPr>
-      <w:bookmarkStart w:id="42" w:name="_qq08s2sjh70s" w:colFirst="0" w:colLast="0"/>
-      <w:bookmarkEnd w:id="42"/>
+      <w:bookmarkStart w:id="41" w:name="_qq08s2sjh70s" w:colFirst="0" w:colLast="0"/>
+      <w:bookmarkEnd w:id="41"/>
     </w:p>
     <w:p>
       <w:pPr>
@@ -21323,9 +21255,9 @@
           <w:szCs w:val="22"/>
         </w:rPr>
       </w:pPr>
-      <w:bookmarkStart w:id="43" w:name="_11j603rd723r" w:colFirst="0" w:colLast="0"/>
-      <w:bookmarkStart w:id="44" w:name="_Toc243721569"/>
-      <w:bookmarkEnd w:id="43"/>
+      <w:bookmarkStart w:id="42" w:name="_11j603rd723r" w:colFirst="0" w:colLast="0"/>
+      <w:bookmarkStart w:id="43" w:name="_Toc243912841"/>
+      <w:bookmarkEnd w:id="42"/>
       <w:r>
         <w:rPr>
           <w:sz w:val="22"/>
@@ -21333,7 +21265,7 @@
         </w:rPr>
         <w:t>B.2 Divergências entre o texto do ERS e os diagramas a corrigir</w:t>
       </w:r>
-      <w:bookmarkEnd w:id="44"/>
+      <w:bookmarkEnd w:id="43"/>
     </w:p>
     <w:p>
       <w:pPr>
@@ -22619,9 +22551,9 @@
           <w:szCs w:val="22"/>
         </w:rPr>
       </w:pPr>
-      <w:bookmarkStart w:id="45" w:name="_c2tkhmjsz8pv" w:colFirst="0" w:colLast="0"/>
-      <w:bookmarkStart w:id="46" w:name="_Toc243721570"/>
-      <w:bookmarkEnd w:id="45"/>
+      <w:bookmarkStart w:id="44" w:name="_c2tkhmjsz8pv" w:colFirst="0" w:colLast="0"/>
+      <w:bookmarkStart w:id="45" w:name="_Toc243912842"/>
+      <w:bookmarkEnd w:id="44"/>
       <w:r>
         <w:rPr>
           <w:sz w:val="22"/>
@@ -22629,7 +22561,7 @@
         </w:rPr>
         <w:t>B.4 Dificuldades e mudanças de escopo</w:t>
       </w:r>
-      <w:bookmarkEnd w:id="46"/>
+      <w:bookmarkEnd w:id="45"/>
     </w:p>
     <w:p>
       <w:pPr>
@@ -23962,9 +23894,9 @@
           <w:szCs w:val="26"/>
         </w:rPr>
       </w:pPr>
-      <w:bookmarkStart w:id="47" w:name="_66ymbsg8vqt" w:colFirst="0" w:colLast="0"/>
-      <w:bookmarkStart w:id="48" w:name="_Toc243721571"/>
-      <w:bookmarkEnd w:id="47"/>
+      <w:bookmarkStart w:id="46" w:name="_66ymbsg8vqt" w:colFirst="0" w:colLast="0"/>
+      <w:bookmarkStart w:id="47" w:name="_Toc243912843"/>
+      <w:bookmarkEnd w:id="46"/>
       <w:r>
         <w:rPr>
           <w:sz w:val="26"/>
@@ -23972,7 +23904,7 @@
         </w:rPr>
         <w:t>Apêndice C – Evidências dos testes</w:t>
       </w:r>
-      <w:bookmarkEnd w:id="48"/>
+      <w:bookmarkEnd w:id="47"/>
     </w:p>
     <w:p>
       <w:pPr>

</xml_diff>